<commit_message>
Clarify full-screen maps and modular web app
Co-authored-by: arena-agent <297053741+arena-agent@users.noreply.github.com>
</commit_message>
<xml_diff>
--- a/hamrah-product-plan-fa.docx
+++ b/hamrah-product-plan-fa.docx
@@ -1150,6 +1150,79 @@
       </w:tr>
     </w:tbl>
     <w:p/>
+    <w:p>
+      <w:pPr>
+        <w:pStyle w:val="Heading3"/>
+        <w:bidi w:val="1"/>
+        <w:jc w:val="right"/>
+      </w:pPr>
+      <w:r>
+        <w:rPr>
+          <w:rFonts w:ascii="Tahoma" w:hAnsi="Tahoma"/>
+        </w:rPr>
+        <w:t>ماهیت وب‌اپلیکیشن، چندسکویی و ساختار ماژولار</w:t>
+      </w:r>
+    </w:p>
+    <w:p>
+      <w:pPr>
+        <w:bidi w:val="1"/>
+        <w:jc w:val="right"/>
+      </w:pPr>
+      <w:r>
+        <w:rPr>
+          <w:rFonts w:ascii="Tahoma" w:hAnsi="Tahoma"/>
+        </w:rPr>
+        <w:t>همراه یک وب‌اپلیکیشن واکنش‌گرا و چندسکویی است: مسافر، مترجم و مدیر از طریق مرورگر دستگاه خود به محیط نقش مربوط وارد می‌شوند. یک تجربهٔ مشترک با سازگاری برای تلفن همراه، تبلت و رایانه ارائه می‌شود؛ کاربران برحسب نقش به قابلیت‌های مناسب دسترسی دارند. چندسکویی بودن به معنی وجود هم‌زمان سه نرم‌افزار بومی مجزا یا در دسترس بودن همهٔ امکانات روی همهٔ مرورگرها بدون آزمون نیست.</w:t>
+      </w:r>
+    </w:p>
+    <w:p>
+      <w:pPr>
+        <w:bidi w:val="1"/>
+        <w:jc w:val="right"/>
+      </w:pPr>
+      <w:r>
+        <w:rPr>
+          <w:rFonts w:ascii="Tahoma" w:hAnsi="Tahoma"/>
+        </w:rPr>
+        <w:t>چیدمان بر اساس عرض و ارتفاع واقعی صفحه، جهت زبان، اندازهٔ متن، ورودی لمسی یا صفحه‌کلید و ناحیهٔ امن دستگاه تغییر می‌کند. سناریوهای کلیدی در مرورگرهای رایج روی اندروید، آیفون و رایانه بررسی می‌شوند. نصب روی صفحهٔ اصلی در مرورگرهای پشتیبانی‌شده با نام و نشان همراه فراهم شود؛ نصب و اعلان مرورگری در دستگاه‌ها یا مرورگرهای فاقد پشتیبانی باید با توضیح روشن محدود شوند، نه اینکه تضمین شوند.</w:t>
+      </w:r>
+    </w:p>
+    <w:p>
+      <w:pPr>
+        <w:bidi w:val="1"/>
+        <w:jc w:val="right"/>
+      </w:pPr>
+      <w:r>
+        <w:rPr>
+          <w:rFonts w:ascii="Tahoma" w:hAnsi="Tahoma"/>
+        </w:rPr>
+        <w:t>محصول از نظر عملکرد به ماژول‌های مستقل و قابل نگهداری تقسیم می‌شود: ورود و حساب؛ پروفایل و مدارک؛ مصاحبه و صلاحیت؛ شهر، نقشه و موقعیت؛ رزرو و زمان‌بندی؛ تطبیق و پیشنهاد؛ مأموریت و کنترل خدمت؛ تغییر و تمدید؛ پرداخت نقدی و اختلاف؛ اعلان و پشتیبانی؛ مدیریت، گزارش و ممیزی؛ و تنظیمات و مجوزها. هر ماژول مسئول اطلاعات و قواعد خود است و از طریق ارتباط‌های مشخص با دیگر ماژول‌ها کار می‌کند.</w:t>
+      </w:r>
+    </w:p>
+    <w:p>
+      <w:pPr>
+        <w:bidi w:val="1"/>
+        <w:jc w:val="right"/>
+      </w:pPr>
+      <w:r>
+        <w:rPr>
+          <w:rFonts w:ascii="Tahoma" w:hAnsi="Tahoma"/>
+        </w:rPr>
+        <w:t>ماژولار بودن الزام به چند سامانهٔ جدا یا فناوری خاص نیست. جدا بودن مسئولیت‌ها نباید موجب چند نسخهٔ ناسازگار از وضعیت، مبلغ یا هویت شود؛ نتیجهٔ نهایی هر عملیات باید برای همهٔ نقش‌های مجاز یکسان و قابل پیگیری باشد. تغییر یا آزمون یک ماژول باید تا حد امکان بدون دستکاری غیرضروری سایر بخش‌ها انجام‌پذیر باشد.</w:t>
+      </w:r>
+    </w:p>
+    <w:p>
+      <w:pPr>
+        <w:bidi w:val="1"/>
+        <w:jc w:val="right"/>
+      </w:pPr>
+      <w:r>
+        <w:rPr>
+          <w:rFonts w:ascii="Tahoma" w:hAnsi="Tahoma"/>
+        </w:rPr>
+        <w:t>دسترسی‌ها، امنیت، ترجمه، طراحی مشترک و مدیریت خطا در همهٔ ماژول‌ها یکپارچه‌اند. در قطع اینترنت، صرفاً بخش‌هایی که واقعاً پشتیبانی آفلاین دارند قابل استفاده‌اند؛ ثبت رزرو، تغییر وضعیت، پرداخت و تأییدها تا اتصال و تأیید سامانه موفق فرض نمی‌شوند.</w:t>
+      </w:r>
+    </w:p>
     <w:p>
       <w:pPr>
         <w:pStyle w:val="Heading2"/>
@@ -2642,10 +2715,7 @@
         <w:jc w:val="right"/>
       </w:pPr>
       <w:r>
-        <w:rPr>
-          <w:rFonts w:ascii="Tahoma" w:hAnsi="Tahoma" w:cs="Tahoma"/>
-        </w:rPr>
-        <w:t>• تبلت و دسکتاپ: از عرض ۷۶۸ پیکسل به بالا، استفاده از دو ستون برای جزئیات و فرم‌ها مجاز است؛ در عرض حدود ۱۲۸۰ پیکسل نقشه و پنل کنار هم، با عرض محتوای مناسب و حاشیهٔ کافی. هیچ جدول عریضی نباید باعث بریدگی کل صفحه شود؛ اسکرول افقی داخلی یا کارت جایگزین در موبایل لازم است.</w:t>
+        <w:t>• تبلت و دسکتاپ: از عرض ۷۶۸ پیکسل به بالا، صفحه‌های جزئیات و فرم‌ها می‌توانند دو ستونی باشند؛ اما در صفحهٔ اصلی مسافر و میز کار نقشه‌محور مترجم، نقشه همچنان تمام عرض و ارتفاع فضای دید را به‌عنوان پس‌زمینه پر می‌کند و پنل روی نقشه قرار می‌گیرد، نه در ستون جداگانه‌ای که عرض نقشه را کم کند. در عرض حدود ۱۲۸۰ پیکسل پنل شناور در کنار صفحه و روی نقشه قرار دارد. هیچ جدول عریضی نباید باعث بریدگی کل صفحه شود؛ برای جدول‌ها اسکرول افقی داخلی یا کارت جایگزین در موبایل لازم است.</w:t>
       </w:r>
     </w:p>
     <w:p>
@@ -2695,6 +2765,79 @@
           <w:rFonts w:ascii="Tahoma" w:hAnsi="Tahoma" w:cs="Tahoma"/>
         </w:rPr>
         <w:t>فارسی و عربی راست‌به‌چپ؛ انگلیسی چپ‌به‌راست. زبان انتخاب‌شده بعد از خروج و بازکردن مجدد حفظ شود. تمام دکمه‌ها، خطاها، عنوان‌ها، وضعیت‌ها و متن‌های خالی اپ مسافر در هر سه زبان ترجمه شوند؛ ترکیب اصطلاحات فارسی در صفحهٔ انگلیسی و بالعکس قابل قبول نیست. تاریخ و عدد با زبان صفحه و زمان‌های عملیاتی با زمان منطقهٔ خدمت نمایش داده شوند.</w:t>
+      </w:r>
+    </w:p>
+    <w:p>
+      <w:pPr>
+        <w:pStyle w:val="Heading3"/>
+        <w:bidi w:val="1"/>
+        <w:jc w:val="right"/>
+      </w:pPr>
+      <w:r>
+        <w:rPr>
+          <w:rFonts w:ascii="Tahoma" w:hAnsi="Tahoma" w:cs="Tahoma"/>
+        </w:rPr>
+        <w:t>الزام صریح نقشهٔ تمام‌صفحه و لایه‌های شناور</w:t>
+      </w:r>
+    </w:p>
+    <w:p>
+      <w:pPr>
+        <w:bidi w:val="1"/>
+        <w:jc w:val="right"/>
+      </w:pPr>
+      <w:r>
+        <w:rPr>
+          <w:rFonts w:ascii="Tahoma" w:hAnsi="Tahoma" w:cs="Tahoma"/>
+        </w:rPr>
+        <w:t>صفحهٔ اصلی مسافر و میز کار اصلی مترجم از لحظهٔ باز شدن تا زمانی که کاربر به یک صفحهٔ مستقل دیگر می‌رود، یک نقشهٔ تعاملی را به‌صورت پس‌زمینهٔ تمام‌صفحه نمایش می‌دهند. نقشه عرض و ارتفاع ناحیهٔ قابل دیدن دستگاه را پر می‌کند و در پشت همهٔ پنل‌ها و سربرگ ادامه دارد. این الزام برای موبایل، تبلت و دسکتاپ یکسان است؛ طراحی دو ستون مستقل که یکی نقشه را محدود کند، جایگزین قابل قبول نیست.</w:t>
+      </w:r>
+    </w:p>
+    <w:p>
+      <w:pPr>
+        <w:bidi w:val="1"/>
+        <w:jc w:val="right"/>
+      </w:pPr>
+      <w:r>
+        <w:rPr>
+          <w:rFonts w:ascii="Tahoma" w:hAnsi="Tahoma" w:cs="Tahoma"/>
+        </w:rPr>
+        <w:t>چیدمان موبایل: سربرگ شفاف یا نیمه‌شفاف در بالا و نوار دسترسی در پایین به‌صورت لایهٔ شناور قرار می‌گیرند. پنل اصلی از پایین روی نقشه باز می‌شود؛ دستگیره، عنوان، محتوای قابل پیمایش و دکمهٔ اصلی دارد. پنل در حالت جمع‌شده باید فضای کافی برای دیدن نقشه بگذارد و در حالت باز به‌صورت عمودی پیمایش شود. حاشیه‌های امن دستگاه و صفحه‌کلید مجازی محتوای ضروری و دکمه را نپوشانند.</w:t>
+      </w:r>
+    </w:p>
+    <w:p>
+      <w:pPr>
+        <w:bidi w:val="1"/>
+        <w:jc w:val="right"/>
+      </w:pPr>
+      <w:r>
+        <w:rPr>
+          <w:rFonts w:ascii="Tahoma" w:hAnsi="Tahoma" w:cs="Tahoma"/>
+        </w:rPr>
+        <w:t>چیدمان دسکتاپ: نقشه همچنان پشت کل صفحه است. پنل شناور با عرض تقریبی ۳۶۰ تا ۴۴۰ پیکسل و فاصلهٔ حدود ۱۶ پیکسل از لبه روی نقشه قرار می‌گیرد و ارتفاع و محتوای آن با فضای دید سازگار است. نوار بالایی و کنترل‌های نقشه روی آن لایه‌بندی می‌شوند؛ در صفحهٔ فارسی پنل اصلی در سمت راست قرار گیرد و در صفحهٔ انگلیسی متناسب با جهت چیدمان منعکس شود.</w:t>
+      </w:r>
+    </w:p>
+    <w:p>
+      <w:pPr>
+        <w:bidi w:val="1"/>
+        <w:jc w:val="right"/>
+      </w:pPr>
+      <w:r>
+        <w:rPr>
+          <w:rFonts w:ascii="Tahoma" w:hAnsi="Tahoma" w:cs="Tahoma"/>
+        </w:rPr>
+        <w:t>نشانگر محل ملاقات و کنترل بزرگ‌نمایی و راهنما بر فراز نقشه خوانا و قابل لمس باشند. وقتی پنل باز یا بسته می‌شود، محل ملاقات انتخاب‌شده با تنظیم موقعیت نمای نقشه در قسمت قابل مشاهده بماند. پنل از نظر دیداری بر نقشه سایهٔ نرم دارد اما نباید کلیک یا لمس نقاط باز نقشه را مسدود کند. سایر صفحه‌های مستقل، مانند فاکتور، حساب و فهرست‌های مدیریتی، الزام به نمایش دائمی نقشه ندارند.</w:t>
+      </w:r>
+    </w:p>
+    <w:p>
+      <w:pPr>
+        <w:bidi w:val="1"/>
+        <w:jc w:val="right"/>
+      </w:pPr>
+      <w:r>
+        <w:rPr>
+          <w:rFonts w:ascii="Tahoma" w:hAnsi="Tahoma" w:cs="Tahoma"/>
+        </w:rPr>
+        <w:t>تمام‌صفحه بودن نقشه به معنی ردیابی زندهٔ مترجم، تخمین زمان رسیدن یا نقشهٔ مسیر نیست. این قابلیت‌ها تا زمان تصمیم و پیاده‌سازی جداگانه غیرفعال و بدون ادعای ساختگی باقی می‌مانند.</w:t>
       </w:r>
     </w:p>
     <w:p>
@@ -3183,10 +3326,7 @@
         <w:jc w:val="right"/>
       </w:pPr>
       <w:r>
-        <w:rPr>
-          <w:rFonts w:ascii="Tahoma" w:hAnsi="Tahoma" w:cs="Tahoma"/>
-        </w:rPr>
-        <w:t>• لایهٔ زمینه نقشهٔ واقعی است. سربرگ با نام همراه، انتخاب زبان، دسترسی به حساب و راهنما؛ پنل کشویی شامل «درخواست مترجم»، خلاصهٔ گزینه‌ها و دکمهٔ اصلی؛ نوار دسترسی به خانه، رزروها، اطلاعات مترجمان و حساب.</w:t>
+        <w:t>• نقشهٔ واقعی، پس‌زمینهٔ تمام‌صفحهٔ خانهٔ مسافر است: از لبهٔ چپ تا راست و از بالای فضای دید تا پایین آن امتداد دارد و زیر سربرگ، پنل و نوار دسترسی نیز ادامه می‌یابد. نقشه داخل کارت یا ستون محدود قرار نگیرد. سربرگ، کنترل‌ها و پنل درخواست لایه‌های شناور روی نقشه‌اند؛ اطلاعات اصلی و نقطهٔ انتخاب‌شده نباید زیر پنل پنهان بمانند.</w:t>
       </w:r>
     </w:p>
     <w:p>
@@ -4170,10 +4310,7 @@
         <w:jc w:val="right"/>
       </w:pPr>
       <w:r>
-        <w:rPr>
-          <w:rFonts w:ascii="Tahoma" w:hAnsi="Tahoma" w:cs="Tahoma"/>
-        </w:rPr>
-        <w:t>• صفحهٔ اصلی نقشه‌محور با سربرگ شامل نام برند، دسترسی اعلان، پروفایل، پشتیبانی و کلید آماده/غیرفعال است. در موبایل پنل کشویی از پایین روی نقشه و در دسکتاپ پنل کناری در مجاورت نقشه قرار گیرد.</w:t>
+        <w:t>• میز کار اصلی مترجم نقشهٔ تمام‌صفحه دارد: نقشه تمام عرض و ارتفاع فضای دید را پر می‌کند و زیر سربرگ و پنل‌ها ادامه می‌یابد. سربرگ شامل نام برند، اعلان، پروفایل، پشتیبانی و کلید آماده/غیرفعال است. در موبایل پنل کشویی از پایین روی نقشه و در دسکتاپ پنل شناور کنار صفحه روی نقشه قرار گیرد؛ هیچ پنلی نقشه را به ستون جداگانه محدود نکند.</w:t>
       </w:r>
     </w:p>
     <w:p>
@@ -11520,6 +11657,24 @@
     </w:p>
     <w:p>
       <w:pPr>
+        <w:jc w:val="right"/>
+        <w:bidi w:val="1"/>
+      </w:pPr>
+      <w:r>
+        <w:t>• در صفحهٔ اصلی هر دو نقش مسافر و مترجم، نقشه در تمام ابعاد دستگاه زیر پنل و سربرگ امتداد داشته باشد؛ پنل موبایل از پایین و پنل دسکتاپ به شکل شناور روی نقشه باز شود. نمای نقطهٔ ملاقات با باز و بسته‌شدن پنل قابل مشاهده و نقشه در نواحی باز قابل تعامل بماند.</w:t>
+      </w:r>
+    </w:p>
+    <w:p>
+      <w:pPr>
+        <w:jc w:val="right"/>
+        <w:bidi w:val="1"/>
+      </w:pPr>
+      <w:r>
+        <w:t>• ساختار ماژولار، دسترسی یکپارچه، هماهنگی وضعیت بین بخش‌ها و اجرا در مرورگرهای پشتیبانی‌شدهٔ موبایل، تبلت و رایانه به‌صورت عملی بررسی شوند؛ محدودیت نصب یا اعلان در مرورگرهای مختلف صادقانه اعلام شود.</w:t>
+      </w:r>
+    </w:p>
+    <w:p>
+      <w:pPr>
         <w:bidi w:val="1"/>
         <w:jc w:val="right"/>
       </w:pPr>

</xml_diff>

<commit_message>
Specify separate translator registration and app login
Co-authored-by: arena-agent <297053741+arena-agent@users.noreply.github.com>
</commit_message>
<xml_diff>
--- a/hamrah-product-plan-fa.docx
+++ b/hamrah-product-plan-fa.docx
@@ -157,10 +157,7 @@
         <w:jc w:val="right"/>
       </w:pPr>
       <w:r>
-        <w:rPr>
-          <w:rFonts w:ascii="Tahoma" w:hAnsi="Tahoma" w:cs="Tahoma"/>
-        </w:rPr>
-        <w:t>۸. اپ مترجم: جذب و ثبت‌نام</w:t>
+        <w:t>۸. سامانهٔ مستقل ثبت‌نام مترجمان</w:t>
       </w:r>
     </w:p>
     <w:p>
@@ -393,10 +390,7 @@
         <w:jc w:val="right"/>
       </w:pPr>
       <w:r>
-        <w:rPr>
-          <w:rFonts w:ascii="Tahoma" w:hAnsi="Tahoma" w:cs="Tahoma"/>
-        </w:rPr>
-        <w:t>همراه بستری برای ثبت درخواست مترجم حضوری، پیدا کردن مترجم واجد شرایط، مدیریت مأموریت، پایان خدمت، ثبت پرداخت نقدی و رسیدگی مدیریتی به امور است. محصول سه محیط جدا دارد: اپ مسافر، اپ مترجم و پنل مدیریت. هر محیط به نیازهای همان نقش پاسخ می‌دهد و اطلاعات خصوصی دیگران را فقط در حد ضرورت نمایش می‌دهد.</w:t>
+        <w:t>همراه بستری برای ثبت درخواست مترجم حضوری، پیدا کردن مترجم واجد شرایط، مدیریت مأموریت، پایان خدمت، ثبت پرداخت نقدی و رسیدگی مدیریتی به امور است. محصول چهار محیط مجزا دارد: اپ مسافر، سامانهٔ مستقل ثبت‌نام مترجمان، اپ مترجم و پنل مدیریت. سامانهٔ ثبت‌نام و اپ مترجم از نظر صفحه و نشانی جدا هستند، ولی به حساب و اطلاعات مرکزی مشترک متصل‌اند. هر محیط به نیاز همان نقش پاسخ می‌دهد و اطلاعات خصوصی دیگران را فقط در حد ضرورت نمایش می‌دهد.</w:t>
       </w:r>
     </w:p>
     <w:p>
@@ -2989,16 +2983,10 @@
           <w:p>
             <w:pPr>
               <w:bidi w:val="1"/>
-              <w:spacing w:after="40"/>
               <w:jc w:val="right"/>
             </w:pPr>
             <w:r>
-              <w:rPr>
-                <w:rFonts w:ascii="Tahoma" w:hAnsi="Tahoma" w:cs="Tahoma"/>
-                <w:b w:val="0"/>
-                <w:sz w:val="19"/>
-              </w:rPr>
-              <w:t>ورود و ثبت‌نام پنج‌مرحله‌ای؛ وضعیت پرونده؛ میز کار نقشه‌محور؛ آمادگی؛ پیشنهادها؛ مأموریت‌ها و تقویم؛ مدارک و صلاحیت؛ مصاحبه؛ درآمد و پرداخت‌های در انتظار؛ اعلان‌ها؛ پروفایل و تنظیمات؛ پشتیبانی.</w:t>
+              <w:t>ورود با شمارهٔ ثبت‌شده؛ نمایش وضعیت دسترسی؛ میز کار نقشه‌محور؛ آمادگی؛ پیشنهادها؛ مأموریت‌ها و تقویم؛ مدارک و صلاحیت؛ درآمد و پرداخت‌های در انتظار؛ اعلان‌ها؛ پروفایل و تنظیمات؛ پشتیبانی. فرایند ثبت‌نام اولیه در محیطی جداگانه انجام می‌شود.</w:t>
             </w:r>
           </w:p>
         </w:tc>
@@ -3093,10 +3081,7 @@
         <w:jc w:val="right"/>
       </w:pPr>
       <w:r>
-        <w:rPr>
-          <w:rFonts w:ascii="Tahoma" w:hAnsi="Tahoma" w:cs="Tahoma"/>
-        </w:rPr>
-        <w:t>۱. کاربر نقش و شماره را وارد می‌کند؛ ارقام فارسی، عربی و لاتین پذیرفته و به قالب یکسان تبدیل شوند. برای مترجم شمارهٔ همراه ایرانی معتبر لازم است؛ برای مسافر علاوه بر آن شمارهٔ بین‌المللی با علامت مثبت و ۸ تا ۱۵ رقم پذیرفته می‌شود.</w:t>
+        <w:t>۱. مسافر در صفحهٔ ورود خود و مترجم در صفحهٔ ورود اپ مترجم، شماره را وارد می‌کند؛ ارقام فارسی، عربی و لاتین پذیرفته و به قالب یکسان تبدیل شوند. مترجم پیش از این باید در سامانهٔ مستقل ثبت‌نام پرونده ساخته باشد. برای مترجم شمارهٔ همراه ایرانی معتبر لازم است؛ برای مسافر علاوه بر آن شمارهٔ بین‌المللی با علامت مثبت و ۸ تا ۱۵ رقم پذیرفته می‌شود.</w:t>
       </w:r>
     </w:p>
     <w:p>
@@ -3141,10 +3126,7 @@
         <w:jc w:val="right"/>
       </w:pPr>
       <w:r>
-        <w:rPr>
-          <w:rFonts w:ascii="Tahoma" w:hAnsi="Tahoma" w:cs="Tahoma"/>
-        </w:rPr>
-        <w:t>۵. پس از تأیید معتبر، نشست ایجاد شود. حساب مسافر و مترجم حتی با شمارهٔ یکسان از نظر نقش و اطلاعات از یکدیگر مستقل‌اند. انقضای نشست کاربر ۳۰ روز و نشست مدیریت ۸ ساعت است.</w:t>
+        <w:t>۵. پس از تأیید معتبر، نشست برای حساب موجود ایجاد شود. ورود از اپ مترجم برای شماره‌ای که در سامانهٔ ثبت‌نام پرونده ندارد نباید حساب یا پروندهٔ تازه بسازد. حساب مسافر و مترجم حتی با شمارهٔ یکسان از نظر نقش و اطلاعات مستقل‌اند. انقضای نشست کاربر ۳۰ روز و نشست مدیریت ۸ ساعت است.</w:t>
       </w:r>
     </w:p>
     <w:p>
@@ -3676,10 +3658,92 @@
         <w:jc w:val="right"/>
       </w:pPr>
       <w:r>
+        <w:t>۸. سامانهٔ مستقل ثبت‌نام مترجمان</w:t>
+      </w:r>
+    </w:p>
+    <w:p>
+      <w:pPr>
+        <w:pStyle w:val="Heading3"/>
+        <w:bidi w:val="1"/>
+        <w:jc w:val="right"/>
+      </w:pPr>
+      <w:r>
         <w:rPr>
-          <w:rFonts w:ascii="Tahoma" w:hAnsi="Tahoma" w:cs="Tahoma"/>
+          <w:rFonts w:ascii="Tahoma" w:hAnsi="Tahoma"/>
         </w:rPr>
-        <w:t>۸. اپ مترجم: جذب و ثبت‌نام</w:t>
+        <w:t>تفکیک ثبت‌نام از اپ مترجم</w:t>
+      </w:r>
+    </w:p>
+    <w:p>
+      <w:pPr>
+        <w:bidi w:val="1"/>
+        <w:jc w:val="right"/>
+      </w:pPr>
+      <w:r>
+        <w:rPr>
+          <w:rFonts w:ascii="Tahoma" w:hAnsi="Tahoma"/>
+        </w:rPr>
+        <w:t>سامانهٔ ثبت‌نام مترجمان یک محیط وب مستقل، با نشانی و صفحهٔ مخصوص خود و جدا از وب‌اپ مترجم است. تمام مراحل ساخت پروندهٔ اولیه، بررسی شرایط همکاری، ورود اطلاعات، ارائهٔ مدارک، نوبت مصاحبه و مشاهدهٔ نتیجهٔ اولیه در همان سامانهٔ مستقل انجام می‌شود. اپ مترجم فرم ثبت‌نام اولیه و مراحل پنج‌گانه ندارد.</w:t>
+      </w:r>
+    </w:p>
+    <w:p>
+      <w:pPr>
+        <w:bidi w:val="1"/>
+        <w:jc w:val="right"/>
+      </w:pPr>
+      <w:r>
+        <w:rPr>
+          <w:rFonts w:ascii="Tahoma" w:hAnsi="Tahoma"/>
+        </w:rPr>
+        <w:t>ثبت‌نام و اپ مترجم از اطلاعات مرکزی مشترک استفاده می‌کنند؛ شمارهٔ تلفن تأییدشده، شناسهٔ حساب، پرونده، مدارک و وضعیت تأیید یکسان‌اند. ثبت‌نام مجدد برای ورود به اپ لازم نیست. هر شمارهٔ مترجم تنها یک حساب مترجم دارد؛ بازیابی یا ادامهٔ پروندهٔ ناتمام باید همان حساب را باز کند و پروندهٔ تکراری نسازد. شمارهٔ مسافر در نقش دیگر حساب مستقلی محسوب می‌شود.</w:t>
+      </w:r>
+    </w:p>
+    <w:p>
+      <w:pPr>
+        <w:bidi w:val="1"/>
+        <w:jc w:val="right"/>
+      </w:pPr>
+      <w:r>
+        <w:rPr>
+          <w:rFonts w:ascii="Tahoma" w:hAnsi="Tahoma"/>
+        </w:rPr>
+        <w:t>دسترسی به سامانهٔ ثبت‌نام از نشانی مستقل آن انجام می‌شود. صفحهٔ ورود اپ مترجم می‌تواند پیوند «درخواست عضویت» داشته باشد که کاربر را به همان سامانهٔ مستقل منتقل می‌کند؛ این پیوند فقط جابه‌جایی است و نباید فرم یا مرحلهٔ ثبت‌نام را در داخل اپ باز کند. بازگشت از ثبت‌نام به اپ کاربر را به صفحهٔ ورود اپ می‌برد، نه اینکه بدون بررسی وضعیت وارد میز کار کند.</w:t>
+      </w:r>
+    </w:p>
+    <w:p>
+      <w:pPr>
+        <w:bidi w:val="1"/>
+        <w:jc w:val="right"/>
+      </w:pPr>
+      <w:r>
+        <w:rPr>
+          <w:rFonts w:ascii="Tahoma" w:hAnsi="Tahoma"/>
+        </w:rPr>
+        <w:t>مترجم با همان شمارهٔ ثبت‌شده و تأیید مالکیت شماره وارد اپ می‌شود. پس از احراز، سامانه وضعیت پرونده را از اطلاعات مرکزی می‌خواند. اگر تأیید و فعال باشد میز کار را باز می‌کند؛ اگر در انتظار بررسی یا ناقص است پیام وضعیت را نشان می‌دهد و برای مشاهده و تکمیل پرونده راهی به سامانهٔ ثبت‌نام ارائه می‌کند؛ اگر رد یا معلق است علت قابل نمایش و راه ارتباطی مجاز ارائه می‌شود و میز کار و دریافت سفارش فعال نمی‌شوند.</w:t>
+      </w:r>
+    </w:p>
+    <w:p>
+      <w:pPr>
+        <w:bidi w:val="1"/>
+        <w:jc w:val="right"/>
+      </w:pPr>
+      <w:r>
+        <w:rPr>
+          <w:rFonts w:ascii="Tahoma" w:hAnsi="Tahoma"/>
+        </w:rPr>
+        <w:t>اگر شماره در سامانهٔ ثبت‌نام مترجمان وجود ندارد، اپ نباید پرونده بسازد یا به ویزارد ثبت‌نام برود. پیام خنثی و راه رفتن به سامانهٔ مستقل ثبت‌نام نشان داده شود. پاسخ درخواست کد نباید امکان تشخیص انبوه شماره‌های ثبت‌شده را ایجاد کند؛ جزئیات وضعیت حساب فقط پس از تأیید معتبر مالکیت شماره نمایش داده شوند. خطای شبکه، رمز اشتباه و نتیجهٔ نامشخص ورود، مجوز دسترسی ایجاد نمی‌کنند.</w:t>
+      </w:r>
+    </w:p>
+    <w:p>
+      <w:pPr>
+        <w:bidi w:val="1"/>
+        <w:jc w:val="right"/>
+      </w:pPr>
+      <w:r>
+        <w:rPr>
+          <w:rFonts w:ascii="Tahoma" w:hAnsi="Tahoma"/>
+        </w:rPr>
+        <w:t>در محیط آزمایشی همان کد ثابت ۱۲۳۴۵۶ برای تأیید شماره در هر دو محیط به کار می‌رود؛ در محیط واقعی بدون فعال‌شدن سرویس پیامک، ورود یا تأیید شماره موفق فرض نمی‌شود. جدا بودن محیط‌ها به معنی دو رمز، دو حساب مستقل یا کپی دستی مدارک نیست.</w:t>
       </w:r>
     </w:p>
     <w:p>
@@ -3810,16 +3874,10 @@
           <w:p>
             <w:pPr>
               <w:bidi w:val="1"/>
-              <w:spacing w:after="40"/>
               <w:jc w:val="right"/>
             </w:pPr>
             <w:r>
-              <w:rPr>
-                <w:rFonts w:ascii="Tahoma" w:hAnsi="Tahoma" w:cs="Tahoma"/>
-                <w:b w:val="0"/>
-                <w:sz w:val="19"/>
-              </w:rPr>
-              <w:t>شماره، کد ورود و آشنایی با شرایط همکاری</w:t>
+              <w:t>شماره، تأیید مالکیت شماره و آشنایی با شرایط همکاری در سامانهٔ ثبت‌نام</w:t>
             </w:r>
           </w:p>
         </w:tc>
@@ -11680,6 +11738,18 @@
       </w:pPr>
       <w:r>
         <w:rPr>
+          <w:rFonts w:ascii="Tahoma" w:hAnsi="Tahoma"/>
+        </w:rPr>
+        <w:t>• ثبت‌نام اولیهٔ مترجم در محیط مستقل آزمایش شود: تکمیل پرونده، بررسی مدیر، ورود با همان شماره در اپ و بازشدن میز کار فقط پس از فعال‌سازی. شمارهٔ ثبت‌نشده در اپ نباید حساب تازه بسازد و فرم پنج‌مرحله‌ای نباید داخل اپ باز شود. وضعیت‌های ناقص، منتظر، ردشده و معلق، ثبت‌نام تکراری، ورود اشتباه و قطع شبکه جداگانه بررسی شوند.</w:t>
+      </w:r>
+    </w:p>
+    <w:p>
+      <w:pPr>
+        <w:bidi w:val="1"/>
+        <w:jc w:val="right"/>
+      </w:pPr>
+      <w:r>
+        <w:rPr>
           <w:rFonts w:ascii="Tahoma" w:hAnsi="Tahoma" w:cs="Tahoma"/>
         </w:rPr>
         <w:t>پایان سند.</w:t>

</xml_diff>

<commit_message>
Detail translator language and vehicle updates
Co-authored-by: arena-agent <297053741+arena-agent@users.noreply.github.com>
</commit_message>
<xml_diff>
--- a/hamrah-product-plan-fa.docx
+++ b/hamrah-product-plan-fa.docx
@@ -4019,16 +4019,10 @@
           <w:p>
             <w:pPr>
               <w:bidi w:val="1"/>
-              <w:spacing w:after="40"/>
               <w:jc w:val="right"/>
             </w:pPr>
             <w:r>
-              <w:rPr>
-                <w:rFonts w:ascii="Tahoma" w:hAnsi="Tahoma" w:cs="Tahoma"/>
-                <w:b w:val="0"/>
-                <w:sz w:val="19"/>
-              </w:rPr>
-              <w:t>دست‌کم یک زبان انتخاب شود؛ نوبت از ظرفیت واقعی انتخاب شود.</w:t>
+              <w:t>دست‌کم یک زبان خارجی انتخاب شود؛ آزمون هر زبان جداگانه ارزیابی و نتیجهٔ آن جدا ثبت شود. یک نوبت می‌تواند چند زبان را پوشش دهد.</w:t>
             </w:r>
           </w:p>
         </w:tc>
@@ -4245,10 +4239,7 @@
         <w:jc w:val="right"/>
       </w:pPr>
       <w:r>
-        <w:rPr>
-          <w:rFonts w:ascii="Tahoma" w:hAnsi="Tahoma" w:cs="Tahoma"/>
-        </w:rPr>
-        <w:t>• کارشناس جذب زمان‌های واقعی مصاحبه می‌سازد. مترجم دارای زبان انتخاب‌شده می‌تواند یک نوبت آزاد آینده را انتخاب کند؛ یک نوبت هم‌زمان به دو نفر اختصاص داده نشود و شخص دارای نوبت فعال یا قبولی، نوبت دیگری نگیرد.</w:t>
+        <w:t>• کارشناس جذب نوبت‌های واقعی مصاحبه می‌سازد و زبان یا زبان‌های مورد ارزیابی هر نوبت را مشخص می‌کند. مترجم برای هر زبان خارجی انتخابی که هنوز در آن قبول نشده است نوبت مناسب می‌گیرد؛ در یک نوبت می‌توان چند زبان را بررسی کرد، مشروط به آنکه نتیجهٔ هر زبان جدا ثبت شود. یک نوبت به دو نفر اختصاص داده نشود؛ برای هر زبان هم‌زمان بیش از یک نوبت فعال رزرو نشود. قبولی در یک زبان مانع رزرو مصاحبه برای زبان جدید نیست.</w:t>
       </w:r>
     </w:p>
     <w:p>
@@ -4281,10 +4272,7 @@
         <w:jc w:val="right"/>
       </w:pPr>
       <w:r>
-        <w:rPr>
-          <w:rFonts w:ascii="Tahoma" w:hAnsi="Tahoma" w:cs="Tahoma"/>
-        </w:rPr>
-        <w:t>• حوزه‌های گردشگری و زیارتی پایه‌اند. پزشکی، بازرگانی و حقوقی/اداری تخصصی‌اند؛ برای دریافت پیشنهاد در حوزهٔ تخصصی، مترجم باید آن حوزه را انتخاب کرده و مدرک زبان تأییدشده و دارای اعتبار داشته باشد. مدرک تخصص تکمیلی پرونده است و به‌تنهایی جای مدرک زبان را نمی‌گیرد.</w:t>
+        <w:t>• گردشگری و زیارتی حوزه‌های پایه و پزشکی، بازرگانی و حقوقی/اداری حوزه‌های تخصصی‌اند. برای درخواست پایه، انتخاب حوزه، قبولی در آزمون زبان‌های لازم و فعال بودن حساب کافی است و نداشتن مدرک زبان مانع حوزهٔ پایه نمی‌شود. برای درخواست تخصصی، علاوه بر آزمون‌های قبول‌شده، مترجم باید حوزه را انتخاب کرده و برای هر زبان خارجی موردنیاز آن درخواست مدرک زبان مربوط، تأییدشده و معتبر داشته باشد. فارسی به‌عنوان زبان پایه در مصاحبه ارزیابی می‌شود و به مدرک زبان جداگانه نیاز ندارد. اگر هیچ‌کدام از دو زبان درخواست فارسی نباشد، هر دو زبان باید مدرک معتبر جدا داشته باشند. مدارک تخصصی تکمیلی پرونده‌اند و جایگزین مدرک زبان مربوط نمی‌شوند.</w:t>
       </w:r>
     </w:p>
     <w:p>
@@ -4338,6 +4326,239 @@
     </w:p>
     <w:p>
       <w:pPr>
+        <w:pStyle w:val="Heading3"/>
+        <w:bidi w:val="1"/>
+        <w:jc w:val="right"/>
+      </w:pPr>
+      <w:r>
+        <w:rPr>
+          <w:rFonts w:ascii="Tahoma" w:hAnsi="Tahoma"/>
+        </w:rPr>
+        <w:t>۸٫۵ فعالیت پایه بدون مدرک زبان و خودرو</w:t>
+      </w:r>
+    </w:p>
+    <w:p>
+      <w:pPr>
+        <w:bidi w:val="1"/>
+        <w:jc w:val="right"/>
+      </w:pPr>
+      <w:r>
+        <w:rPr>
+          <w:rFonts w:ascii="Tahoma" w:hAnsi="Tahoma"/>
+        </w:rPr>
+        <w:t>مترجمی که یک زبان خارجی را می‌داند، در آزمون آن زبان و ارزیابی فارسی قبول شده، حوزهٔ گردشگری یا زیارتی را انتخاب کرده و سایر شرایط عمومی و تأیید حساب را گذرانده است، بدون مدرک زبان و بدون خودرو می‌تواند فعال شود. او فقط پیشنهاد پیاده در حوزه‌های پایه و برای جفت‌زبان‌های آزمون‌قبول‌شده و سایر شرایط منطبق دریافت می‌کند. نداشتن مدرک زبان به‌تنهایی مانع ثبت‌نام، مصاحبه، بررسی نهایی، ورود به میز کار یا فعالیت پایه نیست.</w:t>
+      </w:r>
+    </w:p>
+    <w:p>
+      <w:pPr>
+        <w:bidi w:val="1"/>
+        <w:jc w:val="right"/>
+      </w:pPr>
+      <w:r>
+        <w:rPr>
+          <w:rFonts w:ascii="Tahoma" w:hAnsi="Tahoma"/>
+        </w:rPr>
+        <w:t>در این وضعیت کارت صلاحیت باید روشن بگوید: «گردشگری و زیارتی: مجاز با زبان‌های تأییدشده»، «خدمات تخصصی: نیازمند مدرک زبان مربوط»، و «خودرو: ثبت نشده؛ فقط مأموریت پیاده». در صورت انتخاب نکردن یکی از حوزه‌های پایه، آن حوزه مجاز فرض نمی‌شود. هیچ علامت تأیید مدرک یا خودرو بدون ثبت و بررسی واقعی نمایش داده نشود.</w:t>
+      </w:r>
+    </w:p>
+    <w:p>
+      <w:pPr>
+        <w:pStyle w:val="Heading3"/>
+        <w:bidi w:val="1"/>
+        <w:jc w:val="right"/>
+      </w:pPr>
+      <w:r>
+        <w:rPr>
+          <w:rFonts w:ascii="Tahoma" w:hAnsi="Tahoma"/>
+        </w:rPr>
+        <w:t>۸٫۶ تکمیل پرونده پس از شروع فعالیت</w:t>
+      </w:r>
+    </w:p>
+    <w:p>
+      <w:pPr>
+        <w:bidi w:val="1"/>
+        <w:jc w:val="right"/>
+      </w:pPr>
+      <w:r>
+        <w:rPr>
+          <w:rFonts w:ascii="Tahoma" w:hAnsi="Tahoma"/>
+        </w:rPr>
+        <w:t>مترجم پس از فعال شدن، با همان شماره و تأیید ورود به سامانهٔ مستقل ثبت‌نام مترجمان می‌رود و گزینهٔ «پروندهٔ من ← تکمیل و ویرایش» را باز می‌کند. سامانه همان حساب و پروندهٔ قبلی را بازیابی می‌کند؛ ساخت حساب یا ثبت‌نام از ابتدا لازم نیست. در این صفحه بخش‌های جداگانهٔ «زبان‌ها و آزمون»، «مدارک زبان»، «حوزه‌های فعالیت» و «خودرو و مدارک خودرو» نمایش داده شوند. لینک دسترسی از اپ مترجم، در صورت وجود، فقط سامانهٔ مستقل را باز می‌کند و فرم ثبت‌نام را داخل اپ نمایش نمی‌دهد.</w:t>
+      </w:r>
+    </w:p>
+    <w:p>
+      <w:pPr>
+        <w:bidi w:val="1"/>
+        <w:jc w:val="right"/>
+      </w:pPr>
+      <w:r>
+        <w:rPr>
+          <w:rFonts w:ascii="Tahoma" w:hAnsi="Tahoma"/>
+        </w:rPr>
+        <w:t>هر بخش وضعیت فعلی، اطلاعات پذیرفته‌شده، درخواست جدید در انتظار و دکمه‌های مجاز را نشان می‌دهد. با ثبت درخواست، رسید شامل موضوع، زمان ثبت و وضعیت «در انتظار بررسی» نمایش داده شود؛ با خطا یا قطع شبکه موفقیت ادعا نشود و کاربر بتواند وضعیت واقعی را بررسی کند. برای هر مورد هم‌زمان فقط یک درخواست باز از همان نوع و همان زبان یا خودرو وجود داشته باشد؛ لغو پیش‌نویس یا رد درخواست، اطلاعات قبلاً تأییدشده را پاک نمی‌کند.</w:t>
+      </w:r>
+    </w:p>
+    <w:p>
+      <w:pPr>
+        <w:bidi w:val="1"/>
+        <w:jc w:val="right"/>
+      </w:pPr>
+      <w:r>
+        <w:rPr>
+          <w:rFonts w:ascii="Tahoma" w:hAnsi="Tahoma"/>
+        </w:rPr>
+        <w:t>بررسی مدرک، زبان یا خودرو باعث توقف خودکار فعالیت‌های قبلاً تأییدشده نمی‌شود. تا تصمیم کارشناس، موارد پذیرفته‌شدهٔ قبلی و شرایط قبلی پیشنهاد معتبرند و فقط قابلیت جدید در انتظار است. اگر یک مورد قبلی واقعاً منقضی، تعلیق یا با تصمیم مجاز لغو شود، فقط محدودیت مربوط اعمال و علت و زمان به مترجم اعلام شود؛ وضعیت حساب و سایر صلاحیت‌ها بی‌دلیل تغییر نکنند. درخواست‌ها و تصمیم‌ها همراه نام کارشناس، زمان، دلیل و تاریخچه ثبت شوند.</w:t>
+      </w:r>
+    </w:p>
+    <w:p>
+      <w:pPr>
+        <w:pStyle w:val="Heading3"/>
+        <w:bidi w:val="1"/>
+        <w:jc w:val="right"/>
+      </w:pPr>
+      <w:r>
+        <w:rPr>
+          <w:rFonts w:ascii="Tahoma" w:hAnsi="Tahoma"/>
+        </w:rPr>
+        <w:t>۸٫۷ افزودن مدرک زبان و زبان جدید</w:t>
+      </w:r>
+    </w:p>
+    <w:p>
+      <w:pPr>
+        <w:bidi w:val="1"/>
+        <w:jc w:val="right"/>
+      </w:pPr>
+      <w:r>
+        <w:rPr>
+          <w:rFonts w:ascii="Tahoma" w:hAnsi="Tahoma"/>
+        </w:rPr>
+        <w:t>برای هر زبان خارجی یک کارت مستقل با نام زبان، وضعیت آزمون، تاریخ نتیجه، وضعیت مدرک، تاریخ اعتبار در صورت وجود، حوزه‌های قابل استفاده و اقدامات بعدی وجود دارد. وضعیت آزمون می‌تواند «درخواست نشده»، «در انتظار نوبت»، «نوبت رزروشده»، «قبول»، «نیازمند آزمون مجدد» یا «عدم حضور» باشد. وضعیت مدرک می‌تواند «ثبت نشده»، «در انتظار بررسی»، «تأییدشده»، «ردشده با دلیل» یا «منقضی‌شده» باشد. وضعیت آزمون و مدرک از هم مستقل‌اند؛ داشتن یکی به معنی قبولی دیگری نیست.</w:t>
+      </w:r>
+    </w:p>
+    <w:p>
+      <w:pPr>
+        <w:bidi w:val="1"/>
+        <w:jc w:val="right"/>
+      </w:pPr>
+      <w:r>
+        <w:rPr>
+          <w:rFonts w:ascii="Tahoma" w:hAnsi="Tahoma"/>
+        </w:rPr>
+        <w:t>اگر مترجم برای زبانی که پیش‌تر آزمون آن را قبول شده مدرک بگیرد، در کارت همان زبان گزینهٔ «افزودن مدرک» را انتخاب می‌کند، فایل و مشخصات لازم و تاریخ انقضا در صورت درج روی مدرک را ثبت می‌کند و برای بررسی می‌فرستد. در صورت رد، علت و امکان ارسال مجدد نمایش داده شود؛ در صورت تأیید، مدرک فقط برای همان زبان معتبر است. اگر تاریخ پایان مشخص نشده باشد، مدرک تا تصمیم معتبر بعدی بدون تاریخ پایان ثبت می‌شود؛ اگر تاریخ دارد، از زمان انقضا دیگر برای صلاحیت تخصصی معتبر نیست.</w:t>
+      </w:r>
+    </w:p>
+    <w:p>
+      <w:pPr>
+        <w:bidi w:val="1"/>
+        <w:jc w:val="right"/>
+      </w:pPr>
+      <w:r>
+        <w:rPr>
+          <w:rFonts w:ascii="Tahoma" w:hAnsi="Tahoma"/>
+        </w:rPr>
+        <w:t>برای اضافه‌کردن زبان تازه، مترجم زبان را انتخاب و در صورت داشتن، مدرک مربوط را ثبت می‌کند. برای آن زبان نوبت مصاحبه می‌گیرد؛ کارشناس نتیجهٔ همان زبان را جداگانه ثبت می‌کند. تا قبولی در آزمون زبان جدید، آن زبان در تطبیق درخواست به کار نمی‌رود، حتی اگر مدرکش تأیید شده باشد. قبولی آزمون به‌تنهایی امکان استفاده از زبان جدید در حوزه‌های پایهٔ انتخاب‌شده را پس از بررسی سایر شرایط فراهم می‌کند؛ برای حوزهٔ تخصصی، مدرک تأییدشده و معتبر همان زبان نیز لازم است.</w:t>
+      </w:r>
+    </w:p>
+    <w:p>
+      <w:pPr>
+        <w:bidi w:val="1"/>
+        <w:jc w:val="right"/>
+      </w:pPr>
+      <w:r>
+        <w:rPr>
+          <w:rFonts w:ascii="Tahoma" w:hAnsi="Tahoma"/>
+        </w:rPr>
+        <w:t>اگر مترجم برای یک زبان موجود مدرک جدید یا جایگزین بفرستد، تا تصمیم کارشناس مدرک قبلیِ تأییدشده و معتبر همچنان ملاک است. رد مدرک جدید به‌خودی‌خود مدرک قبلی معتبر را باطل نمی‌کند. سوابق قبلی برای مدیریت قابل پیگیری باشند. اگر مدرک قبلی منقضی شود، بخش تخصصی مرتبط بسته و حوزهٔ پایهٔ همان زبان، در صورت باقی بودن نتیجهٔ آزمون و شرایط عمومی، برقرار می‌ماند.</w:t>
+      </w:r>
+    </w:p>
+    <w:p>
+      <w:pPr>
+        <w:bidi w:val="1"/>
+        <w:jc w:val="right"/>
+      </w:pPr>
+      <w:r>
+        <w:rPr>
+          <w:rFonts w:ascii="Tahoma" w:hAnsi="Tahoma"/>
+        </w:rPr>
+        <w:t>نمونهٔ عملی: مترجم در عربی قبول شده، مدرکی ندارد و برای گردشگری و زیارتی پیاده فعال است. بعداً مدرک عربی را می‌فرستد؛ پس از تأیید، در صورت انتخاب حوزهٔ پزشکی و احراز دیگر شرایط، می‌تواند درخواست تخصصی عربی–فارسی بگیرد. سپس انگلیسی را اضافه می‌کند: تا قبولی آزمون انگلیسی نمی‌تواند برای آن زبان پیشنهاد بگیرد؛ پس از قبولی، خدمات پایهٔ انگلیسی و پس از تأیید مدرک انگلیسی، حوزه‌های تخصصی انتخاب‌شدهٔ انگلیسی ممکن می‌شوند. در تمام این مدت فعالیت پایهٔ عربی او پابرجاست.</w:t>
+      </w:r>
+    </w:p>
+    <w:p>
+      <w:pPr>
+        <w:pStyle w:val="Heading3"/>
+        <w:bidi w:val="1"/>
+        <w:jc w:val="right"/>
+      </w:pPr>
+      <w:r>
+        <w:rPr>
+          <w:rFonts w:ascii="Tahoma" w:hAnsi="Tahoma"/>
+        </w:rPr>
+        <w:t>۸٫۸ ثبت خودرو در آینده</w:t>
+      </w:r>
+    </w:p>
+    <w:p>
+      <w:pPr>
+        <w:bidi w:val="1"/>
+        <w:jc w:val="right"/>
+      </w:pPr>
+      <w:r>
+        <w:rPr>
+          <w:rFonts w:ascii="Tahoma" w:hAnsi="Tahoma"/>
+        </w:rPr>
+        <w:t>مترجمی که در ابتدا خودرو ندارد، هر زمان می‌تواند وارد بخش خودرو در همان سامانهٔ مستقل شود و گزینهٔ «افزودن خودرو» را بزند. مدل خودرو و ظرفیت سرنشین از ۱ تا ۸ نفر را ثبت می‌کند و تصویر مدارک خودرو و گواهینامه و تاریخ اعتبار آن‌ها را ارائه می‌دهد. برای هر مدرک، نوع، فایل، وضعیت بررسی، دلیل رد و انقضا نمایش داده شود.</w:t>
+      </w:r>
+    </w:p>
+    <w:p>
+      <w:pPr>
+        <w:bidi w:val="1"/>
+        <w:jc w:val="right"/>
+      </w:pPr>
+      <w:r>
+        <w:rPr>
+          <w:rFonts w:ascii="Tahoma" w:hAnsi="Tahoma"/>
+        </w:rPr>
+        <w:t>پس از ارسال، خودرو و مدارک در وضعیت انتظار بررسی هستند. تا تأیید هر دو مدرکِ معتبر و تکمیل مشخصات، مترجم همچنان فقط مأموریت پیادهٔ مجاز می‌گیرد. پس از تأیید، مأموریت خودرویی فقط در صورتی پیشنهاد می‌شود که ظرفیت خودرو حداقل برابر تعداد مسافران باشد و تمام سایر شرایط تطبیق برقرار باشد. نمایش مدل تأییدشدهٔ خودرو به مسافر فقط پس از پذیرش مأموریت مجاز است.</w:t>
+      </w:r>
+    </w:p>
+    <w:p>
+      <w:pPr>
+        <w:bidi w:val="1"/>
+        <w:jc w:val="right"/>
+      </w:pPr>
+      <w:r>
+        <w:rPr>
+          <w:rFonts w:ascii="Tahoma" w:hAnsi="Tahoma"/>
+        </w:rPr>
+        <w:t>مترجم می‌تواند بعداً مشخصات یا مدارک خودرو را برای اصلاح، تمدید یا جایگزینی ارسال کند؛ ثبت تغییر و تأیید آن قابل پیگیری است. اطلاعات قبلیِ معتبر تا پایان بررسی جایگزین ملاک می‌مانند. اگر خودرو یا گواهینامه عملاً منقضی، رد نهایی یا غیرفعال شود، پیشنهادهای خودرویی جدید متوقف می‌شوند و فعالیت پیادهٔ مجاز ادامه دارد. دربارهٔ مأموریت پذیرفته‌شدهٔ قبلی، تغییر خودکار، لغو یا وعدهٔ خودرو بدون بررسی و اطلاع طرفین انجام نشود.</w:t>
+      </w:r>
+    </w:p>
+    <w:p>
+      <w:pPr>
+        <w:pStyle w:val="Heading3"/>
+        <w:bidi w:val="1"/>
+        <w:jc w:val="right"/>
+      </w:pPr>
+      <w:r>
+        <w:rPr>
+          <w:rFonts w:ascii="Tahoma" w:hAnsi="Tahoma"/>
+        </w:rPr>
+        <w:t>۸٫۹ نقش کارشناس و اطلاع‌رسانی</w:t>
+      </w:r>
+    </w:p>
+    <w:p>
+      <w:pPr>
+        <w:bidi w:val="1"/>
+        <w:jc w:val="right"/>
+      </w:pPr>
+      <w:r>
+        <w:rPr>
+          <w:rFonts w:ascii="Tahoma" w:hAnsi="Tahoma"/>
+        </w:rPr>
+        <w:t>کارشناس جذب در پروندهٔ مترجم درخواست‌های هر زبان، آزمون، مدرک و خودرو را به تفکیک می‌بیند. او می‌تواند نوبت مناسب ثبت، نتیجهٔ زبان را اعلام و مدرک یا اطلاعات خودرو را تأیید یا با دلیل رد کند. هر تصمیم تنها بر مورد مورد بررسی اثر می‌گذارد و با عامل و زمان در سوابق ثبت می‌شود. مترجم نتیجه و اقدام بعدی را در سامانهٔ پرونده و به‌صورت اعلان مجاز دریافت می‌کند. کارشناس نمی‌تواند با تأیید مدرک، قبولی آزمون را بدون ثبت نتیجه ایجاد کند یا با رد مورد تازه، صلاحیت معتبر دیگری را بی‌دلیل پاک کند.</w:t>
+      </w:r>
+    </w:p>
+    <w:p>
+      <w:pPr>
         <w:pStyle w:val="Heading2"/>
         <w:bidi w:val="1"/>
         <w:jc w:val="right"/>
@@ -4670,10 +4891,7 @@
         <w:jc w:val="right"/>
       </w:pPr>
       <w:r>
-        <w:rPr>
-          <w:rFonts w:ascii="Tahoma" w:hAnsi="Tahoma" w:cs="Tahoma"/>
-        </w:rPr>
-        <w:t>مترجم باید در شهر مربوط فعال و آماده، دارای مصاحبهٔ قبول‌شده و هر دو زبان انتخابی رزرو باشد؛ حوزه را انتخاب کرده و گیت مدرک تخصصی را گذرانده باشد؛ ترجیحات جنسیت دوطرفه را رعایت کند؛ اگر خودرو لازم است واجد شرایط و ظرفیت کافی باشد؛ بدهی نقدی تسویه‌نشده نداشته باشد؛ پیشنهاد باز دیگر نداشته و برای همان رزرو قبلاً پیشنهاد دریافت نکرده باشد؛ و مأموریت پذیرفته‌شدهٔ دیگری در فاصلهٔ کمتر از دو ساعت از زمان شروع نداشته باشد.</w:t>
+        <w:t>مترجم باید در شهر مربوط فعال و آماده، برای همهٔ زبان‌های انتخابی رزرو دارای نتیجهٔ قبول‌شده، و در حوزهٔ انتخابی واجد شرایط باشد؛ برای درخواست تخصصی، مدرک معتبرِ تأییدشدهٔ مربوط به هر زبان خارجی همان رزرو لازم است. ترجیحات جنسیت دوطرفه، شرایط و ظرفیت خودرو در صورت نیاز، نبود بدهی نقدی تسویه‌نشده، نداشتن پیشنهاد باز دیگر و پیشنهاد قبلی همان رزرو و نداشتن مأموریت پذیرفته‌شدهٔ دیگر در فاصلهٔ کمتر از دو ساعت از زمان شروع نیز بررسی می‌شوند.</w:t>
       </w:r>
     </w:p>
     <w:p>
@@ -8492,16 +8710,10 @@
           <w:p>
             <w:pPr>
               <w:bidi w:val="1"/>
-              <w:spacing w:after="40"/>
               <w:jc w:val="right"/>
             </w:pPr>
             <w:r>
-              <w:rPr>
-                <w:rFonts w:ascii="Tahoma" w:hAnsi="Tahoma" w:cs="Tahoma"/>
-                <w:b w:val="0"/>
-                <w:sz w:val="19"/>
-              </w:rPr>
-              <w:t>نام، شهر، جنسیت، زبان‌ها، حوزه‌ها، وضعیت، نتیجهٔ مصاحبه، ترجیحات، امتیاز و خودرو</w:t>
+              <w:t>نام، شهر، جنسیت، وضعیت حساب، حوزه‌ها، ترجیحات، امتیاز و خودرو؛ برای هر زبان: وضعیت آزمون، نتیجه و تاریخ؛ وضعیت مدرک، شماره و اعتبار در صورت وجود، و نتیجهٔ بررسی.</w:t>
             </w:r>
           </w:p>
         </w:tc>
@@ -11585,10 +11797,19 @@
         <w:jc w:val="right"/>
       </w:pPr>
       <w:r>
+        <w:t>مترجمِ فعال و قبول‌شده در آزمون زبان، بدون مدرک زبان و بدون خودرو می‌تواند در حوزه‌های گردشگری و زیارتی مأموریت پیاده بگیرد. برای حوزهٔ تخصصی باید مدرک زبان خارجی همان درخواست تأیید و معتبر باشد. هنگام بررسی مدرک جدید یا زبان تازه، صلاحیت پایه و زبان‌های قبلاً تأییدشده حفظ می‌شوند. خودرو بدون مدارک تأییدشده یا با ظرفیت ناکافی پیشنهاد سواره نمی‌گیرد. بدهی مثبت مانع پیشنهاد تازه است.</w:t>
+      </w:r>
+    </w:p>
+    <w:p>
+      <w:pPr>
+        <w:bidi w:val="1"/>
+        <w:jc w:val="right"/>
+      </w:pPr>
+      <w:r>
         <w:rPr>
-          <w:rFonts w:ascii="Tahoma" w:hAnsi="Tahoma" w:cs="Tahoma"/>
+          <w:rFonts w:ascii="Tahoma" w:hAnsi="Tahoma"/>
         </w:rPr>
-        <w:t>مترجم بدون مدرک زبان معتبر، حوزهٔ تخصصی دریافت نمی‌کند. با تأیید مدرک، در صورت وجود سایر شرایط واجد می‌شود. خودرو بدون بیمه و گواهینامهٔ تأییدشده یا با ظرفیت کمتر از تعداد مسافران پیشنهاد سواره نمی‌گیرد. بدهی مثبت نیز مانع دریافت پیشنهاد تازه می‌شود.</w:t>
+        <w:t>سناریوی تکمیل پرونده: مترجم عربیِ فعال بدون مدرک و بدون خودرو در حوزه‌های پایه کار می‌کند؛ با همان حساب مدرک عربی ثبت و پس از تأیید، صلاحیت تخصصی همان زبان را دریافت می‌کند. زبان انگلیسی جداگانه با آزمون و مدرک مستقل اضافه می‌شود. سپس خودرو با ظرفیت و دو مدرک ثبت و پس از تأیید برای مأموریت خودرویی باز می‌شود. طی بررسی‌های جدید، فعالیت پایهٔ عربی نباید قطع شود؛ رد، انقضا، تمدید، درخواست تکراری، خطای شبکه و بازیابی پس از ورود دوباره نیز بررسی شوند.</w:t>
       </w:r>
     </w:p>
     <w:p>

</xml_diff>

<commit_message>
Update translator registration and language qualification rules
Co-authored-by: arena-agent <297053741+arena-agent@users.noreply.github.com>
</commit_message>
<xml_diff>
--- a/hamrah-product-plan-fa.docx
+++ b/hamrah-product-plan-fa.docx
@@ -3680,10 +3680,7 @@
         <w:jc w:val="right"/>
       </w:pPr>
       <w:r>
-        <w:rPr>
-          <w:rFonts w:ascii="Tahoma" w:hAnsi="Tahoma"/>
-        </w:rPr>
-        <w:t>سامانهٔ ثبت‌نام مترجمان یک محیط وب مستقل، با نشانی و صفحهٔ مخصوص خود و جدا از وب‌اپ مترجم است. تمام مراحل ساخت پروندهٔ اولیه، بررسی شرایط همکاری، ورود اطلاعات، ارائهٔ مدارک، نوبت مصاحبه و مشاهدهٔ نتیجهٔ اولیه در همان سامانهٔ مستقل انجام می‌شود. اپ مترجم فرم ثبت‌نام اولیه و مراحل پنج‌گانه ندارد.</w:t>
+        <w:t>سامانهٔ ثبت‌نام مترجمان یک محیط وب مستقل، با نشانی و صفحهٔ مخصوص خود و جدا از وب‌اپ مترجم است. ثبت‌نام اولیه در سه مرحلهٔ تأیید شماره، اطلاعات هویتی اجباری، و زبان، صلاحیت و خودرو انجام می‌شود. تمام مراحل ساخت پرونده، مدارک، آزمون و مشاهدهٔ نتیجه در همین سامانهٔ مستقل است. اپ مترجم فرم ثبت‌نام اولیه ندارد.</w:t>
       </w:r>
     </w:p>
     <w:p>
@@ -3848,19 +3845,15 @@
         <w:tc>
           <w:tcPr>
             <w:tcW w:type="dxa" w:w="4933"/>
-            <w:vAlign w:val="center"/>
           </w:tcPr>
           <w:p>
             <w:pPr>
               <w:bidi w:val="1"/>
-              <w:spacing w:after="40"/>
               <w:jc w:val="right"/>
             </w:pPr>
             <w:r>
               <w:rPr>
-                <w:rFonts w:ascii="Tahoma" w:hAnsi="Tahoma" w:cs="Tahoma"/>
-                <w:b w:val="0"/>
-                <w:sz w:val="19"/>
+                <w:rFonts w:ascii="Tahoma" w:hAnsi="Tahoma"/>
               </w:rPr>
               <w:t>۱</w:t>
             </w:r>
@@ -3869,7 +3862,6 @@
         <w:tc>
           <w:tcPr>
             <w:tcW w:type="dxa" w:w="4933"/>
-            <w:vAlign w:val="center"/>
           </w:tcPr>
           <w:p>
             <w:pPr>
@@ -3877,28 +3869,27 @@
               <w:jc w:val="right"/>
             </w:pPr>
             <w:r>
-              <w:t>شماره، تأیید مالکیت شماره و آشنایی با شرایط همکاری در سامانهٔ ثبت‌نام</w:t>
+              <w:rPr>
+                <w:rFonts w:ascii="Tahoma" w:hAnsi="Tahoma"/>
+              </w:rPr>
+              <w:t>ورود و تأیید شماره</w:t>
             </w:r>
           </w:p>
         </w:tc>
         <w:tc>
           <w:tcPr>
             <w:tcW w:type="dxa" w:w="4933"/>
-            <w:vAlign w:val="center"/>
           </w:tcPr>
           <w:p>
             <w:pPr>
               <w:bidi w:val="1"/>
-              <w:spacing w:after="40"/>
               <w:jc w:val="right"/>
             </w:pPr>
             <w:r>
               <w:rPr>
-                <w:rFonts w:ascii="Tahoma" w:hAnsi="Tahoma" w:cs="Tahoma"/>
-                <w:b w:val="0"/>
-                <w:sz w:val="19"/>
+                <w:rFonts w:ascii="Tahoma" w:hAnsi="Tahoma"/>
               </w:rPr>
-              <w:t>شمارهٔ ایرانی و تأیید واقعی کد لازم است.</w:t>
+              <w:t>شمارهٔ همراه ایرانی و کد تأیید معتبر؛ پذیرش شرایط ورود به سامانه. در محیط آزمایشی کد ثابت است.</w:t>
             </w:r>
           </w:p>
         </w:tc>
@@ -3907,19 +3898,15 @@
         <w:tc>
           <w:tcPr>
             <w:tcW w:type="dxa" w:w="4933"/>
-            <w:vAlign w:val="center"/>
           </w:tcPr>
           <w:p>
             <w:pPr>
               <w:bidi w:val="1"/>
-              <w:spacing w:after="40"/>
               <w:jc w:val="right"/>
             </w:pPr>
             <w:r>
               <w:rPr>
-                <w:rFonts w:ascii="Tahoma" w:hAnsi="Tahoma" w:cs="Tahoma"/>
-                <w:b w:val="0"/>
-                <w:sz w:val="19"/>
+                <w:rFonts w:ascii="Tahoma" w:hAnsi="Tahoma"/>
               </w:rPr>
               <w:t>۲</w:t>
             </w:r>
@@ -3928,42 +3915,34 @@
         <w:tc>
           <w:tcPr>
             <w:tcW w:type="dxa" w:w="4933"/>
-            <w:vAlign w:val="center"/>
           </w:tcPr>
           <w:p>
             <w:pPr>
               <w:bidi w:val="1"/>
-              <w:spacing w:after="40"/>
               <w:jc w:val="right"/>
             </w:pPr>
             <w:r>
               <w:rPr>
-                <w:rFonts w:ascii="Tahoma" w:hAnsi="Tahoma" w:cs="Tahoma"/>
-                <w:b w:val="0"/>
-                <w:sz w:val="19"/>
+                <w:rFonts w:ascii="Tahoma" w:hAnsi="Tahoma"/>
               </w:rPr>
-              <w:t>نام، نام خانوادگی، جنسیت، کد ملی، تاریخ تولد، محل سکونت و مدارک هویتی</w:t>
+              <w:t>اطلاعات شخصی و هویتی اجباری</w:t>
             </w:r>
           </w:p>
         </w:tc>
         <w:tc>
           <w:tcPr>
             <w:tcW w:type="dxa" w:w="4933"/>
-            <w:vAlign w:val="center"/>
           </w:tcPr>
           <w:p>
             <w:pPr>
               <w:bidi w:val="1"/>
-              <w:spacing w:after="40"/>
               <w:jc w:val="right"/>
             </w:pPr>
             <w:r>
               <w:rPr>
-                <w:rFonts w:ascii="Tahoma" w:hAnsi="Tahoma" w:cs="Tahoma"/>
-                <w:b w:val="0"/>
-                <w:sz w:val="19"/>
+                <w:rFonts w:ascii="Tahoma" w:hAnsi="Tahoma"/>
               </w:rPr>
-              <w:t>فیلدهای الزامی فرم مشخص و کامل باشند؛ شمارهٔ ملی ده‌رقمی معتبر از نظر طول.</w:t>
+              <w:t>نام، نام خانوادگی، جنسیت، کد ملی، تاریخ تولد، شهر، نشانی، کد پستی و مدارک هویتی ضروری از جمله کارت ملی و تصویر سلفی. همهٔ این موارد برای رفتن به مرحلهٔ سوم الزامی‌اند.</w:t>
             </w:r>
           </w:p>
         </w:tc>
@@ -3972,19 +3951,15 @@
         <w:tc>
           <w:tcPr>
             <w:tcW w:type="dxa" w:w="4933"/>
-            <w:vAlign w:val="center"/>
           </w:tcPr>
           <w:p>
             <w:pPr>
               <w:bidi w:val="1"/>
-              <w:spacing w:after="40"/>
               <w:jc w:val="right"/>
             </w:pPr>
             <w:r>
               <w:rPr>
-                <w:rFonts w:ascii="Tahoma" w:hAnsi="Tahoma" w:cs="Tahoma"/>
-                <w:b w:val="0"/>
-                <w:sz w:val="19"/>
+                <w:rFonts w:ascii="Tahoma" w:hAnsi="Tahoma"/>
               </w:rPr>
               <w:t>۳</w:t>
             </w:r>
@@ -3993,28 +3968,6 @@
         <w:tc>
           <w:tcPr>
             <w:tcW w:type="dxa" w:w="4933"/>
-            <w:vAlign w:val="center"/>
-          </w:tcPr>
-          <w:p>
-            <w:pPr>
-              <w:bidi w:val="1"/>
-              <w:spacing w:after="40"/>
-              <w:jc w:val="right"/>
-            </w:pPr>
-            <w:r>
-              <w:rPr>
-                <w:rFonts w:ascii="Tahoma" w:hAnsi="Tahoma" w:cs="Tahoma"/>
-                <w:b w:val="0"/>
-                <w:sz w:val="19"/>
-              </w:rPr>
-              <w:t>زبان‌ها، درخواست مصاحبه و انتخاب نوبت</w:t>
-            </w:r>
-          </w:p>
-        </w:tc>
-        <w:tc>
-          <w:tcPr>
-            <w:tcW w:type="dxa" w:w="4933"/>
-            <w:vAlign w:val="center"/>
           </w:tcPr>
           <w:p>
             <w:pPr>
@@ -4022,137 +3975,27 @@
               <w:jc w:val="right"/>
             </w:pPr>
             <w:r>
-              <w:t>دست‌کم یک زبان خارجی انتخاب شود؛ آزمون هر زبان جداگانه ارزیابی و نتیجهٔ آن جدا ثبت شود. یک نوبت می‌تواند چند زبان را پوشش دهد.</w:t>
-            </w:r>
-          </w:p>
-        </w:tc>
-      </w:tr>
-      <w:tr>
-        <w:tc>
-          <w:tcPr>
-            <w:tcW w:type="dxa" w:w="4933"/>
-            <w:vAlign w:val="center"/>
-          </w:tcPr>
-          <w:p>
-            <w:pPr>
-              <w:bidi w:val="1"/>
-              <w:spacing w:after="40"/>
-              <w:jc w:val="right"/>
-            </w:pPr>
-            <w:r>
               <w:rPr>
-                <w:rFonts w:ascii="Tahoma" w:hAnsi="Tahoma" w:cs="Tahoma"/>
-                <w:b w:val="0"/>
-                <w:sz w:val="19"/>
+                <w:rFonts w:ascii="Tahoma" w:hAnsi="Tahoma"/>
               </w:rPr>
-              <w:t>۴</w:t>
+              <w:t>زبان، مسیر مدرک یا آزمون، خودرو و ثبت نهایی</w:t>
             </w:r>
           </w:p>
         </w:tc>
         <w:tc>
           <w:tcPr>
             <w:tcW w:type="dxa" w:w="4933"/>
-            <w:vAlign w:val="center"/>
           </w:tcPr>
           <w:p>
             <w:pPr>
               <w:bidi w:val="1"/>
-              <w:spacing w:after="40"/>
               <w:jc w:val="right"/>
             </w:pPr>
             <w:r>
               <w:rPr>
-                <w:rFonts w:ascii="Tahoma" w:hAnsi="Tahoma" w:cs="Tahoma"/>
-                <w:b w:val="0"/>
-                <w:sz w:val="19"/>
+                <w:rFonts w:ascii="Tahoma" w:hAnsi="Tahoma"/>
               </w:rPr>
-              <w:t>حوزه‌های کاری و اطلاعات خودرو</w:t>
-            </w:r>
-          </w:p>
-        </w:tc>
-        <w:tc>
-          <w:tcPr>
-            <w:tcW w:type="dxa" w:w="4933"/>
-            <w:vAlign w:val="center"/>
-          </w:tcPr>
-          <w:p>
-            <w:pPr>
-              <w:bidi w:val="1"/>
-              <w:spacing w:after="40"/>
-              <w:jc w:val="right"/>
-            </w:pPr>
-            <w:r>
-              <w:rPr>
-                <w:rFonts w:ascii="Tahoma" w:hAnsi="Tahoma" w:cs="Tahoma"/>
-                <w:b w:val="0"/>
-                <w:sz w:val="19"/>
-              </w:rPr>
-              <w:t>دست‌کم یک حوزه؛ خودرو اختیاری و ظرفیت از ۱ تا ۸ نفر.</w:t>
-            </w:r>
-          </w:p>
-        </w:tc>
-      </w:tr>
-      <w:tr>
-        <w:tc>
-          <w:tcPr>
-            <w:tcW w:type="dxa" w:w="4933"/>
-            <w:vAlign w:val="center"/>
-          </w:tcPr>
-          <w:p>
-            <w:pPr>
-              <w:bidi w:val="1"/>
-              <w:spacing w:after="40"/>
-              <w:jc w:val="right"/>
-            </w:pPr>
-            <w:r>
-              <w:rPr>
-                <w:rFonts w:ascii="Tahoma" w:hAnsi="Tahoma" w:cs="Tahoma"/>
-                <w:b w:val="0"/>
-                <w:sz w:val="19"/>
-              </w:rPr>
-              <w:t>۵</w:t>
-            </w:r>
-          </w:p>
-        </w:tc>
-        <w:tc>
-          <w:tcPr>
-            <w:tcW w:type="dxa" w:w="4933"/>
-            <w:vAlign w:val="center"/>
-          </w:tcPr>
-          <w:p>
-            <w:pPr>
-              <w:bidi w:val="1"/>
-              <w:spacing w:after="40"/>
-              <w:jc w:val="right"/>
-            </w:pPr>
-            <w:r>
-              <w:rPr>
-                <w:rFonts w:ascii="Tahoma" w:hAnsi="Tahoma" w:cs="Tahoma"/>
-                <w:b w:val="0"/>
-                <w:sz w:val="19"/>
-              </w:rPr>
-              <w:t>شبا، شرایط محرمانگی و منشور اخلاقی</w:t>
-            </w:r>
-          </w:p>
-        </w:tc>
-        <w:tc>
-          <w:tcPr>
-            <w:tcW w:type="dxa" w:w="4933"/>
-            <w:vAlign w:val="center"/>
-          </w:tcPr>
-          <w:p>
-            <w:pPr>
-              <w:bidi w:val="1"/>
-              <w:spacing w:after="40"/>
-              <w:jc w:val="right"/>
-            </w:pPr>
-            <w:r>
-              <w:rPr>
-                <w:rFonts w:ascii="Tahoma" w:hAnsi="Tahoma" w:cs="Tahoma"/>
-                <w:b w:val="0"/>
-                <w:sz w:val="19"/>
-              </w:rPr>
-              <w:t>شمارهٔ شبا ۲۴ رقم و پذیرش صریح تعهد و منشور لازم است.</w:t>
+              <w:t>انتخاب زبان و برای هر زبان مسیر مدرک یا آزمون؛ انتخاب اختیاری خودرو و ثبت مدارک آن در صورت انتخاب؛ ثبت شبا و پذیرش تعهد محرمانگی و منشور اخلاقی در پایان همین مرحله؛ ارسال پرونده برای بررسی.</w:t>
             </w:r>
           </w:p>
         </w:tc>
@@ -4165,10 +4008,7 @@
         <w:jc w:val="right"/>
       </w:pPr>
       <w:r>
-        <w:rPr>
-          <w:rFonts w:ascii="Tahoma" w:hAnsi="Tahoma" w:cs="Tahoma"/>
-        </w:rPr>
-        <w:t>در موبایل نوار پنج‌مرحله‌ای در بالا و در دسکتاپ فهرست عمودی مراحل کنار فرم نمایش داده شود. مرحلهٔ جاری برجسته، مراحل تکمیل‌شده مشخص و پیشرفت به‌صورت درصدی نشان داده شود. رفتن به مرحلهٔ بعد با اعتبارسنجی همان مرحله؛ بازگشت اطلاعات واردشده را پاک نکند. ارسال نهایی، پرونده را به انتظار بررسی می‌برد و به‌تنهایی مترجم را فعال نمی‌کند.</w:t>
+        <w:t>ثبت‌نام اولیه سه مرحله دارد. در موبایل نوار سه‌مرحله‌ای در بالای فرم و در دسکتاپ فهرست عمودی سه مرحله در کنار فرم نمایش داده شود. مرحلهٔ جاری و مراحل تکمیل‌شده مشخص و پیشرفت بر پایهٔ سه مرحله نشان داده شود. تا تأیید شماره، مرحلهٔ دوم و تا تکمیل تمام اطلاعات و مدارک الزامی مرحلهٔ دوم، مرحلهٔ سوم باز نمی‌شود. ثبت مرحلهٔ سوم، پرونده را برای بررسی می‌فرستد و فعال‌سازی خودکار حساب ایجاد نمی‌کند.</w:t>
       </w:r>
     </w:p>
     <w:p>
@@ -4239,7 +4079,7 @@
         <w:jc w:val="right"/>
       </w:pPr>
       <w:r>
-        <w:t>• کارشناس جذب نوبت‌های واقعی مصاحبه می‌سازد و زبان یا زبان‌های مورد ارزیابی هر نوبت را مشخص می‌کند. مترجم برای هر زبان خارجی انتخابی که هنوز در آن قبول نشده است نوبت مناسب می‌گیرد؛ در یک نوبت می‌توان چند زبان را بررسی کرد، مشروط به آنکه نتیجهٔ هر زبان جدا ثبت شود. یک نوبت به دو نفر اختصاص داده نشود؛ برای هر زبان هم‌زمان بیش از یک نوبت فعال رزرو نشود. قبولی در یک زبان مانع رزرو مصاحبه برای زبان جدید نیست.</w:t>
+        <w:t>• برای هر زبان خارجی مترجم یکی از دو مسیر تأیید را برمی‌گزیند: ارائهٔ مدرک همان زبان یا شرکت در آزمون. در مسیر مدرک، آزمون شرط تأیید آن زبان نیست؛ کارشناس اعتبار مدرک را بررسی می‌کند. در مسیر آزمون، کارشناس نوبت واقعی می‌سازد و پس از آزمون برای همان زبان نتیجه و حوزه‌های مجاز را ثبت می‌کند. در یک نوبت می‌توان چند زبان را بررسی کرد، مشروط به اینکه نتیجه و حوزه‌های هر زبان جداگانه ثبت شوند. قبولی یک زبان مانع درخواست زبان جدید نیست.</w:t>
       </w:r>
     </w:p>
     <w:p>
@@ -4248,10 +4088,7 @@
         <w:jc w:val="right"/>
       </w:pPr>
       <w:r>
-        <w:rPr>
-          <w:rFonts w:ascii="Tahoma" w:hAnsi="Tahoma" w:cs="Tahoma"/>
-        </w:rPr>
-        <w:t>• مدت مصاحبه ۱۰ دقیقه است. زمان و یادداشت هماهنگی در صفحه نمایش داده شود. حدود یک ساعت پیش یادآوری ثبت شود؛ نتیجه «قبول» یا «نیاز به تلاش مجدد» توسط کارشناس ثبت می‌شود. غیبت با وضعیت جداگانه ثبت و امکان نوبت‌گیری بعدی فراهم می‌شود.</w:t>
+        <w:t>• در صورت انتخاب مسیر آزمون، مدت پایهٔ مصاحبه ۱۰ دقیقه است و زمان و یادداشت هماهنگی به مترجم نمایش داده می‌شود. حدود یک ساعت پیش یادآوری ثبت شود. کارشناس نتیجهٔ «قبول» یا «نیازمند تلاش مجدد» و حوزه‌های مجاز آن زبان را ثبت می‌کند. عدم حضور وضعیت جدا دارد و امکان گرفتن نوبت بعدی محفوظ است. تأیید مدرک زبان در مسیر مدرک به گرفتن نوبت آزمون وابسته نیست.</w:t>
       </w:r>
     </w:p>
     <w:p>
@@ -4272,7 +4109,7 @@
         <w:jc w:val="right"/>
       </w:pPr>
       <w:r>
-        <w:t>• گردشگری و زیارتی حوزه‌های پایه و پزشکی، بازرگانی و حقوقی/اداری حوزه‌های تخصصی‌اند. برای درخواست پایه، انتخاب حوزه، قبولی در آزمون زبان‌های لازم و فعال بودن حساب کافی است و نداشتن مدرک زبان مانع حوزهٔ پایه نمی‌شود. برای درخواست تخصصی، علاوه بر آزمون‌های قبول‌شده، مترجم باید حوزه را انتخاب کرده و برای هر زبان خارجی موردنیاز آن درخواست مدرک زبان مربوط، تأییدشده و معتبر داشته باشد. فارسی به‌عنوان زبان پایه در مصاحبه ارزیابی می‌شود و به مدرک زبان جداگانه نیاز ندارد. اگر هیچ‌کدام از دو زبان درخواست فارسی نباشد، هر دو زبان باید مدرک معتبر جدا داشته باشند. مدارک تخصصی تکمیلی پرونده‌اند و جایگزین مدرک زبان مربوط نمی‌شوند.</w:t>
+        <w:t>• پنج حوزه عبارت‌اند از گردشگری، زیارتی، پزشکی، بازرگانی و حقوقی/اداری. در مسیر مدرک، پس از تأیید مدرک معتبر زبان، هر پنج حوزه برای همان زبان باز می‌شود و آزمون آن زبان شرط نیست. در مسیر آزمون، پس از ارزیابی، کارشناس حوزه‌های مجاز همان زبان را تعیین می‌کند؛ این مجموعه می‌تواند فقط گردشگری و زیارتی یا هر مجموعهٔ دیگری باشد که کارشناس تأیید کرده است. بدون تصمیم کارشناس حوزه‌ای از نتیجهٔ آزمون خودکار باز نشود. دریافت پیشنهاد علاوه بر صلاحیت زبان و حوزه، به فعال‌بودن حساب و سایر شرایط تطبیق وابسته است.</w:t>
       </w:r>
     </w:p>
     <w:p>
@@ -4281,10 +4118,7 @@
         <w:jc w:val="right"/>
       </w:pPr>
       <w:r>
-        <w:rPr>
-          <w:rFonts w:ascii="Tahoma" w:hAnsi="Tahoma" w:cs="Tahoma"/>
-        </w:rPr>
-        <w:t>• انتخاب حوزه و داشتن پرونده به تنهایی کافی نیست؛ وضعیت فعال، نتیجهٔ مصاحبه، شرایط شهر و سایر محدودیت‌های تطبیق نیز لازم‌اند.</w:t>
+        <w:t>• انتخاب حوزه یا ساخت پرونده به‌تنهایی کافی نیست؛ وضعیت فعال، تأیید معتبر همان زبان از مسیر مدرک یا آزمون، مجاز بودن حوزهٔ مرتبط، شرایط شهر و سایر محدودیت‌های تطبیق نیز لازم‌اند. اگر حوزه‌ای برای زبان مربوط باز نشده باشد، پیشنهاد آن زبان و حوزه ارسال نمی‌شود.</w:t>
       </w:r>
     </w:p>
     <w:p>
@@ -4343,10 +4177,7 @@
         <w:jc w:val="right"/>
       </w:pPr>
       <w:r>
-        <w:rPr>
-          <w:rFonts w:ascii="Tahoma" w:hAnsi="Tahoma"/>
-        </w:rPr>
-        <w:t>مترجمی که یک زبان خارجی را می‌داند، در آزمون آن زبان و ارزیابی فارسی قبول شده، حوزهٔ گردشگری یا زیارتی را انتخاب کرده و سایر شرایط عمومی و تأیید حساب را گذرانده است، بدون مدرک زبان و بدون خودرو می‌تواند فعال شود. او فقط پیشنهاد پیاده در حوزه‌های پایه و برای جفت‌زبان‌های آزمون‌قبول‌شده و سایر شرایط منطبق دریافت می‌کند. نداشتن مدرک زبان به‌تنهایی مانع ثبت‌نام، مصاحبه، بررسی نهایی، ورود به میز کار یا فعالیت پایه نیست.</w:t>
+        <w:t>مترجمی که مدرک زبان یا خودرو ندارد می‌تواند مسیر آزمون را برای زبان موردنظر انتخاب کند. اگر در آزمون قبول شود و کارشناس حوزه‌های گردشگری و زیارتی را برای آن زبان باز کند و سایر شرایط عمومی و تأیید حساب برقرار باشند، او می‌تواند در همان حوزه‌ها به‌صورت پیاده فعالیت کند. کارشناس می‌تواند بر اساس ارزیابی آزمون، حوزه‌های دیگری را نیز برای همان زبان باز کند؛ هیچ حوزه‌ای صرفاً از روی نداشتن مدرک یا قبولی آزمون به‌طور خودکار فرض نمی‌شود.</w:t>
       </w:r>
     </w:p>
     <w:p>
@@ -4355,10 +4186,7 @@
         <w:jc w:val="right"/>
       </w:pPr>
       <w:r>
-        <w:rPr>
-          <w:rFonts w:ascii="Tahoma" w:hAnsi="Tahoma"/>
-        </w:rPr>
-        <w:t>در این وضعیت کارت صلاحیت باید روشن بگوید: «گردشگری و زیارتی: مجاز با زبان‌های تأییدشده»، «خدمات تخصصی: نیازمند مدرک زبان مربوط»، و «خودرو: ثبت نشده؛ فقط مأموریت پیاده». در صورت انتخاب نکردن یکی از حوزه‌های پایه، آن حوزه مجاز فرض نمی‌شود. هیچ علامت تأیید مدرک یا خودرو بدون ثبت و بررسی واقعی نمایش داده نشود.</w:t>
+        <w:t>کارت صلاحیت برای هر زبان، مسیر تأیید و فهرست دقیق حوزه‌های تأییدشده توسط کارشناس را نشان می‌دهد؛ نمونه: «عربی: آزمون قبول، گردشگری و زیارتی مجاز» و «خودرو: ثبت نشده، مأموریت پیاده». اگر کارشناس حوزه‌ای را باز نکرده باشد آن حوزه برای آن زبان غیرفعال است. هیچ علامت تأیید مدرک یا خودرو بدون بررسی واقعی نمایش داده نشود.</w:t>
       </w:r>
     </w:p>
     <w:p>
@@ -4429,10 +4257,7 @@
         <w:jc w:val="right"/>
       </w:pPr>
       <w:r>
-        <w:rPr>
-          <w:rFonts w:ascii="Tahoma" w:hAnsi="Tahoma"/>
-        </w:rPr>
-        <w:t>برای هر زبان خارجی یک کارت مستقل با نام زبان، وضعیت آزمون، تاریخ نتیجه، وضعیت مدرک، تاریخ اعتبار در صورت وجود، حوزه‌های قابل استفاده و اقدامات بعدی وجود دارد. وضعیت آزمون می‌تواند «درخواست نشده»، «در انتظار نوبت»، «نوبت رزروشده»، «قبول»، «نیازمند آزمون مجدد» یا «عدم حضور» باشد. وضعیت مدرک می‌تواند «ثبت نشده»، «در انتظار بررسی»، «تأییدشده»، «ردشده با دلیل» یا «منقضی‌شده» باشد. وضعیت آزمون و مدرک از هم مستقل‌اند؛ داشتن یکی به معنی قبولی دیگری نیست.</w:t>
+        <w:t>برای هر زبان خارجی یک کارت مستقل با نام زبان، مسیر انتخابی «مدرک» یا «آزمون»، وضعیت آزمون، تاریخ نتیجه، وضعیت مدرک، تاریخ اعتبار در صورت وجود، فهرست حوزه‌های مجاز و اقدامات بعدی وجود دارد. وضعیت آزمون می‌تواند «درخواست نشده»، «در انتظار نوبت»، «نوبت رزروشده»، «قبول»، «نیازمند آزمون مجدد» یا «عدم حضور» باشد. وضعیت مدرک می‌تواند «ثبت نشده»، «در انتظار بررسی»، «تأییدشده»، «ردشده با دلیل» یا «منقضی‌شده» باشد. تأیید مدرک و نتیجهٔ آزمون جدا ثبت می‌شوند؛ تأیید مدرک به‌تنهایی قبولی آزمون وانمود نمی‌شود، اما طبق مسیر مدرک برای همان زبان همهٔ حوزه‌ها را مجاز می‌کند.</w:t>
       </w:r>
     </w:p>
     <w:p>
@@ -4441,10 +4266,7 @@
         <w:jc w:val="right"/>
       </w:pPr>
       <w:r>
-        <w:rPr>
-          <w:rFonts w:ascii="Tahoma" w:hAnsi="Tahoma"/>
-        </w:rPr>
-        <w:t>اگر مترجم برای زبانی که پیش‌تر آزمون آن را قبول شده مدرک بگیرد، در کارت همان زبان گزینهٔ «افزودن مدرک» را انتخاب می‌کند، فایل و مشخصات لازم و تاریخ انقضا در صورت درج روی مدرک را ثبت می‌کند و برای بررسی می‌فرستد. در صورت رد، علت و امکان ارسال مجدد نمایش داده شود؛ در صورت تأیید، مدرک فقط برای همان زبان معتبر است. اگر تاریخ پایان مشخص نشده باشد، مدرک تا تصمیم معتبر بعدی بدون تاریخ پایان ثبت می‌شود؛ اگر تاریخ دارد، از زمان انقضا دیگر برای صلاحیت تخصصی معتبر نیست.</w:t>
+        <w:t>اگر مترجم برای زبانی که پیش‌تر از مسیر آزمون تأیید شده، بعداً مدرک بگیرد، در کارت همان زبان «افزودن مدرک» را انتخاب و فایل، مشخصات و تاریخ انقضا در صورت وجود را ارسال می‌کند. تا بررسی، حوزه‌های قبلاً تأییدشده از مسیر آزمون برقرار می‌مانند. پس از تأیید مدرک معتبر، هر پنج حوزه برای همان زبان باز می‌شوند، بدون نیاز به آزمون دوباره. در صورت رد، علت و امکان ارسال مجدد نمایش داده می‌شود و مجوزهای آزمون قبلی معتبر باقی می‌مانند.</w:t>
       </w:r>
     </w:p>
     <w:p>
@@ -4453,10 +4275,7 @@
         <w:jc w:val="right"/>
       </w:pPr>
       <w:r>
-        <w:rPr>
-          <w:rFonts w:ascii="Tahoma" w:hAnsi="Tahoma"/>
-        </w:rPr>
-        <w:t>برای اضافه‌کردن زبان تازه، مترجم زبان را انتخاب و در صورت داشتن، مدرک مربوط را ثبت می‌کند. برای آن زبان نوبت مصاحبه می‌گیرد؛ کارشناس نتیجهٔ همان زبان را جداگانه ثبت می‌کند. تا قبولی در آزمون زبان جدید، آن زبان در تطبیق درخواست به کار نمی‌رود، حتی اگر مدرکش تأیید شده باشد. قبولی آزمون به‌تنهایی امکان استفاده از زبان جدید در حوزه‌های پایهٔ انتخاب‌شده را پس از بررسی سایر شرایط فراهم می‌کند؛ برای حوزهٔ تخصصی، مدرک تأییدشده و معتبر همان زبان نیز لازم است.</w:t>
+        <w:t>برای اضافه‌کردن زبان تازه، مترجم با همان حساب در سامانهٔ مستقل زبان را انتخاب می‌کند و برای همان زبان مسیر «مدرک» یا «آزمون» را برمی‌گزیند. در مسیر مدرک، پس از تأیید مدرک معتبر هر پنج حوزه برای آن زبان باز می‌شود و آزمون آن زبان اجباری نیست. در مسیر آزمون، تا پایان ارزیابی و ثبت نتیجه و حوزه‌ها از طرف کارشناس هیچ حوزه‌ای برای زبان تازه مجاز نیست؛ پس از تأیید، فقط حوزه‌های تعیین‌شده برای همان زبان باز می‌شوند. وضعیت زبان‌های قبلی بدون تغییر باقی می‌ماند.</w:t>
       </w:r>
     </w:p>
     <w:p>
@@ -4465,10 +4284,7 @@
         <w:jc w:val="right"/>
       </w:pPr>
       <w:r>
-        <w:rPr>
-          <w:rFonts w:ascii="Tahoma" w:hAnsi="Tahoma"/>
-        </w:rPr>
-        <w:t>اگر مترجم برای یک زبان موجود مدرک جدید یا جایگزین بفرستد، تا تصمیم کارشناس مدرک قبلیِ تأییدشده و معتبر همچنان ملاک است. رد مدرک جدید به‌خودی‌خود مدرک قبلی معتبر را باطل نمی‌کند. سوابق قبلی برای مدیریت قابل پیگیری باشند. اگر مدرک قبلی منقضی شود، بخش تخصصی مرتبط بسته و حوزهٔ پایهٔ همان زبان، در صورت باقی بودن نتیجهٔ آزمون و شرایط عمومی، برقرار می‌ماند.</w:t>
+        <w:t>اگر برای زبان موجود مدرک جدید یا جایگزین ارسال شود، تا تصمیم کارشناس مدرک قبلیِ تأییدشده و معتبر همچنان ملاک است. رد مدرک جدید به‌خودی‌خود مدرک قبلی معتبر یا مجوزهای مستقل آزمون را باطل نمی‌کند. با انقضای مدرک، مجوزی که فقط از آن مدرک حاصل شده بسته می‌شود؛ اگر برای همان زبان آزمون تأییدشده و حوزه‌های مستقل آن وجود داشته باشد، همان حوزه‌ها برقرار می‌مانند. اگر هیچ مسیر معتبر دیگری وجود نداشته باشد، قابلیت آن زبان تا تأیید دوباره متوقف می‌شود؛ سایر زبان‌ها حفظ می‌شوند.</w:t>
       </w:r>
     </w:p>
     <w:p>
@@ -4477,10 +4293,7 @@
         <w:jc w:val="right"/>
       </w:pPr>
       <w:r>
-        <w:rPr>
-          <w:rFonts w:ascii="Tahoma" w:hAnsi="Tahoma"/>
-        </w:rPr>
-        <w:t>نمونهٔ عملی: مترجم در عربی قبول شده، مدرکی ندارد و برای گردشگری و زیارتی پیاده فعال است. بعداً مدرک عربی را می‌فرستد؛ پس از تأیید، در صورت انتخاب حوزهٔ پزشکی و احراز دیگر شرایط، می‌تواند درخواست تخصصی عربی–فارسی بگیرد. سپس انگلیسی را اضافه می‌کند: تا قبولی آزمون انگلیسی نمی‌تواند برای آن زبان پیشنهاد بگیرد؛ پس از قبولی، خدمات پایهٔ انگلیسی و پس از تأیید مدرک انگلیسی، حوزه‌های تخصصی انتخاب‌شدهٔ انگلیسی ممکن می‌شوند. در تمام این مدت فعالیت پایهٔ عربی او پابرجاست.</w:t>
+        <w:t>نمونهٔ عملی: مترجم بدون مدرک در آزمون عربی شرکت می‌کند و کارشناس گردشگری و زیارتی را برای عربی باز می‌کند. بعداً مدرک عربی ثبت و پس از تأیید، هر پنج حوزهٔ عربی باز می‌شوند. سپس انگلیسی را اضافه می‌کند: اگر مدرک انگلیسی را ارائه کند، پس از تأیید همهٔ حوزه‌های انگلیسی بدون آزمون باز می‌شوند؛ اگر آزمون را انتخاب کند، حوزه‌های انگلیسی را کارشناس مشخص می‌کند. در تمام این مدت صلاحیت معتبر عربی حفظ می‌شود.</w:t>
       </w:r>
     </w:p>
     <w:p>
@@ -4551,10 +4364,56 @@
         <w:jc w:val="right"/>
       </w:pPr>
       <w:r>
+        <w:t>کارشناس جذب در پروندهٔ مترجم درخواست‌های هر زبان، مسیر انتخابی، آزمون، حوزه‌های مجاز، مدرک و خودرو را جدا می‌بیند. در مسیر مدرک، پذیرش مدرک معتبر پنج حوزه را برای همان زبان باز می‌کند؛ در مسیر آزمون، کارشناس پس از ارزیابی فهرست حوزه‌های مجاز را مشخص و ثبت می‌کند. او می‌تواند مدرک یا اطلاعات خودرو را با دلیل رد کند. هر تصمیم با عامل و زمان ثبت و نتیجه به مترجم اعلام می‌شود. تأیید مدرک نباید به‌دروغ به‌عنوان قبولی آزمون ثبت شود؛ رد مورد تازه نباید صلاحیت معتبر دیگری را پاک کند.</w:t>
+      </w:r>
+    </w:p>
+    <w:p>
+      <w:pPr>
+        <w:pStyle w:val="Heading3"/>
+        <w:bidi w:val="1"/>
+        <w:jc w:val="right"/>
+      </w:pPr>
+      <w:r>
         <w:rPr>
           <w:rFonts w:ascii="Tahoma" w:hAnsi="Tahoma"/>
         </w:rPr>
-        <w:t>کارشناس جذب در پروندهٔ مترجم درخواست‌های هر زبان، آزمون، مدرک و خودرو را به تفکیک می‌بیند. او می‌تواند نوبت مناسب ثبت، نتیجهٔ زبان را اعلام و مدرک یا اطلاعات خودرو را تأیید یا با دلیل رد کند. هر تصمیم تنها بر مورد مورد بررسی اثر می‌گذارد و با عامل و زمان در سوابق ثبت می‌شود. مترجم نتیجه و اقدام بعدی را در سامانهٔ پرونده و به‌صورت اعلان مجاز دریافت می‌کند. کارشناس نمی‌تواند با تأیید مدرک، قبولی آزمون را بدون ثبت نتیجه ایجاد کند یا با رد مورد تازه، صلاحیت معتبر دیگری را بی‌دلیل پاک کند.</w:t>
+        <w:t>مرحلهٔ سوم: زبان‌ها، خودرو و ثبت نهایی</w:t>
+      </w:r>
+    </w:p>
+    <w:p>
+      <w:pPr>
+        <w:bidi w:val="1"/>
+        <w:jc w:val="right"/>
+      </w:pPr>
+      <w:r>
+        <w:rPr>
+          <w:rFonts w:ascii="Tahoma" w:hAnsi="Tahoma"/>
+        </w:rPr>
+        <w:t>در ابتدای مرحلهٔ سوم دست‌کم یک زبان خارجی انتخاب می‌شود و برای هر زبان یکی از دو مسیر مدرک یا آزمون تعیین می‌گردد. گزینهٔ بدون خودرو از ابتدا انتخاب پیش‌فرض است. اگر مترجم خودرو ندارد، فیلد یا مدرک خودرو اجباری نیست و پس از فعال‌سازی حساب، حالت پیاده با حوزه‌های مجاز بدون تأیید جداگانه فعال می‌شود. اگر خودرو دارد، می‌تواند مدل، ظرفیت و مدارک معتبر خودرو و گواهینامه را در همین مرحله ثبت کند؛ تا تأیید مدارک، حالت پیاده با همان شرایط برقرار است.</w:t>
+      </w:r>
+    </w:p>
+    <w:p>
+      <w:pPr>
+        <w:bidi w:val="1"/>
+        <w:jc w:val="right"/>
+      </w:pPr>
+      <w:r>
+        <w:rPr>
+          <w:rFonts w:ascii="Tahoma" w:hAnsi="Tahoma"/>
+        </w:rPr>
+        <w:t>پس از تأیید مدارک خودرو، قابلیت خودرویی علاوه بر پیاده فعال می‌شود؛ مترجم هر دو نوع مأموریت را با رعایت ترجیحات، ظرفیت و سایر شرایط تطبیق دریافت می‌کند. اگر مدارک خودرو ناقص، ردشده یا منقضی باشند، فقط قابلیت خودرویی غیرفعال می‌ماند. مترجم می‌تواند در هر زمان با همان شماره به سامانهٔ مستقل بازگردد و ثبت خودرو یا مدارک زبان تازه را انجام دهد.</w:t>
+      </w:r>
+    </w:p>
+    <w:p>
+      <w:pPr>
+        <w:bidi w:val="1"/>
+        <w:jc w:val="right"/>
+      </w:pPr>
+      <w:r>
+        <w:rPr>
+          <w:rFonts w:ascii="Tahoma" w:hAnsi="Tahoma"/>
+        </w:rPr>
+        <w:t>پیش از ارسال نهایی مرحلهٔ سوم، شمارهٔ شبا و پذیرش تعهد محرمانگی و منشور اخلاقی ثبت می‌شوند؛ این موارد یک مرحلهٔ چهارم یا پنجم جدا نیستند. ارسال پرونده تنها پس از تکمیل فیلدهای اجباری و انتخاب مسیر هر زبان ممکن است. کارشناس پس از بررسی الزامات حساب را فعال می‌کند؛ برای مسیر آزمون دست‌کم یک حوزهٔ مجاز باید مشخص شود تا آن زبان در تطبیق به کار برود.</w:t>
       </w:r>
     </w:p>
     <w:p>
@@ -4891,7 +4750,7 @@
         <w:jc w:val="right"/>
       </w:pPr>
       <w:r>
-        <w:t>مترجم باید در شهر مربوط فعال و آماده، برای همهٔ زبان‌های انتخابی رزرو دارای نتیجهٔ قبول‌شده، و در حوزهٔ انتخابی واجد شرایط باشد؛ برای درخواست تخصصی، مدرک معتبرِ تأییدشدهٔ مربوط به هر زبان خارجی همان رزرو لازم است. ترجیحات جنسیت دوطرفه، شرایط و ظرفیت خودرو در صورت نیاز، نبود بدهی نقدی تسویه‌نشده، نداشتن پیشنهاد باز دیگر و پیشنهاد قبلی همان رزرو و نداشتن مأموریت پذیرفته‌شدهٔ دیگر در فاصلهٔ کمتر از دو ساعت از زمان شروع نیز بررسی می‌شوند.</w:t>
+        <w:t>مترجم باید در شهر مربوط فعال و آماده باشد و برای هر زبان خارجی لازم در رزرو، حوزهٔ درخواست را از مسیر مدرک تأییدشده یا فهرست حوزه‌های تأییدشدهٔ آزمون همان زبان داشته باشد. برای فارسی به‌عنوان زبان پایه، ارزیابی آن در پرونده انجام می‌شود. در جفت دو زبان خارجی، حوزهٔ درخواست باید در هر دو زبان مجاز باشد. ترجیحات جنسیت دوطرفه، شرایط و ظرفیت خودرو در صورت نیاز، نبود بدهی نقدی تسویه‌نشده، نداشتن پیشنهاد باز دیگر و پیشنهاد قبلی همان رزرو و نداشتن مأموریت پذیرفته‌شدهٔ دیگر در فاصلهٔ کمتر از دو ساعت از زمان شروع نیز بررسی می‌شوند.</w:t>
       </w:r>
     </w:p>
     <w:p>
@@ -11797,7 +11656,7 @@
         <w:jc w:val="right"/>
       </w:pPr>
       <w:r>
-        <w:t>مترجمِ فعال و قبول‌شده در آزمون زبان، بدون مدرک زبان و بدون خودرو می‌تواند در حوزه‌های گردشگری و زیارتی مأموریت پیاده بگیرد. برای حوزهٔ تخصصی باید مدرک زبان خارجی همان درخواست تأیید و معتبر باشد. هنگام بررسی مدرک جدید یا زبان تازه، صلاحیت پایه و زبان‌های قبلاً تأییدشده حفظ می‌شوند. خودرو بدون مدارک تأییدشده یا با ظرفیت ناکافی پیشنهاد سواره نمی‌گیرد. بدهی مثبت مانع پیشنهاد تازه است.</w:t>
+        <w:t>مترجم فعال، بدون مدرک و بدون خودرو، در حوزه‌هایی که کارشناس پس از آزمون برای همان زبان تعیین کرده است مأموریت پیاده می‌گیرد. پس از تأیید مدرک، هر پنج حوزه برای همان زبان باز می‌شود. بررسی مدرک یا زبان جدید صلاحیت معتبر قبلی را متوقف نمی‌کند. تا تأیید خودرو و گواهینامه یا در صورت ظرفیت ناکافی، مأموریت خودرویی پیشنهاد نمی‌شود؛ بدهی مثبت نیز مانع پیشنهاد تازه است.</w:t>
       </w:r>
     </w:p>
     <w:p>
@@ -11806,10 +11665,7 @@
         <w:jc w:val="right"/>
       </w:pPr>
       <w:r>
-        <w:rPr>
-          <w:rFonts w:ascii="Tahoma" w:hAnsi="Tahoma"/>
-        </w:rPr>
-        <w:t>سناریوی تکمیل پرونده: مترجم عربیِ فعال بدون مدرک و بدون خودرو در حوزه‌های پایه کار می‌کند؛ با همان حساب مدرک عربی ثبت و پس از تأیید، صلاحیت تخصصی همان زبان را دریافت می‌کند. زبان انگلیسی جداگانه با آزمون و مدرک مستقل اضافه می‌شود. سپس خودرو با ظرفیت و دو مدرک ثبت و پس از تأیید برای مأموریت خودرویی باز می‌شود. طی بررسی‌های جدید، فعالیت پایهٔ عربی نباید قطع شود؛ رد، انقضا، تمدید، درخواست تکراری، خطای شبکه و بازیابی پس از ورود دوباره نیز بررسی شوند.</w:t>
+        <w:t>سناریوی تکمیل پرونده: مترجم عربیِ فعال، بدون مدرک و بدون خودرو، با حوزه‌هایی که کارشناس پس از آزمون باز کرده به‌صورت پیاده کار می‌کند. با همان حساب مدرک عربی ثبت می‌کند و پس از تأیید هر پنج حوزهٔ عربی باز می‌شود. برای انگلیسی، مدرک تأییدشده بدون آزمون همهٔ حوزه‌ها را باز می‌کند؛ در مسیر آزمون، کارشناس حوزه‌ها را تعیین می‌کند. خودرو بعداً ثبت و تا تأیید آن مأموریت پیاده برقرار است؛ پس از تأیید، هر دو نوع مأموریت در شرایط مجاز ممکن‌اند. رد، انقضا، درخواست تکراری، خطای شبکه و ورود دوباره هم بررسی شوند.</w:t>
       </w:r>
     </w:p>
     <w:p>
@@ -11958,10 +11814,7 @@
         <w:jc w:val="right"/>
       </w:pPr>
       <w:r>
-        <w:rPr>
-          <w:rFonts w:ascii="Tahoma" w:hAnsi="Tahoma"/>
-        </w:rPr>
-        <w:t>• ثبت‌نام اولیهٔ مترجم در محیط مستقل آزمایش شود: تکمیل پرونده، بررسی مدیر، ورود با همان شماره در اپ و بازشدن میز کار فقط پس از فعال‌سازی. شمارهٔ ثبت‌نشده در اپ نباید حساب تازه بسازد و فرم پنج‌مرحله‌ای نباید داخل اپ باز شود. وضعیت‌های ناقص، منتظر، ردشده و معلق، ثبت‌نام تکراری، ورود اشتباه و قطع شبکه جداگانه بررسی شوند.</w:t>
+        <w:t>• ثبت‌نام سه‌مرحله‌ای مترجم در محیط مستقل آزمایش شود: تأیید شماره، تکمیل همهٔ فیلدها و مدارک اجباری هویتی، و سپس انتخاب مسیر مدرک یا آزمون و خودرو. تأیید مدرک باید بدون آزمون پنج حوزهٔ همان زبان را باز کند؛ آزمون فقط حوزه‌های تعیین‌شدهٔ کارشناس را باز کند. مترجم بدون خودرو یا در انتظار تأیید خودرو در حوزه‌های مجاز پیاده فعالیت کند و پس از تأیید خودرو هر دو نوع مأموریت قابل دریافت باشند. ورود با همان شماره و بازشدن میز کار فقط بعد از فعال‌سازی، رد، انقضا، ثبت‌نام تکراری، محدودیت زبان، قطع شبکه و حفظ صلاحیت قبلی بررسی شوند. فرم ثبت‌نام نباید داخل اپ مترجم باز شود.</w:t>
       </w:r>
     </w:p>
     <w:p>

</xml_diff>